<commit_message>
centred the time based moderators
</commit_message>
<xml_diff>
--- a/write_up/Trends in Cranial Capacity of urban-rural mammals.docx
+++ b/write_up/Trends in Cranial Capacity of urban-rural mammals.docx
@@ -237,7 +237,6 @@
                     <w:rFonts w:ascii="Arial" w:hAnsi="Arial"/>
                   </w:rPr>
                 </w:pPr>
-                <w:proofErr w:type="spellStart"/>
                 <w:r>
                   <w:rPr>
                     <w:rFonts w:ascii="Arial" w:hAnsi="Arial"/>
@@ -248,14 +247,7 @@
                   <w:rPr>
                     <w:rFonts w:ascii="Arial" w:hAnsi="Arial"/>
                   </w:rPr>
-                  <w:t>Evolutionary</w:t>
-                </w:r>
-                <w:proofErr w:type="spellEnd"/>
-                <w:r>
-                  <w:rPr>
-                    <w:rFonts w:ascii="Arial" w:hAnsi="Arial"/>
-                  </w:rPr>
-                  <w:t xml:space="preserve"> Responses to Anthropogenic Change</w:t>
+                  <w:t>Evolutionary Responses to Anthropogenic Change</w:t>
                 </w:r>
               </w:p>
             </w:tc>
@@ -2160,53 +2152,23 @@
           <w:sz w:val="22"/>
           <w:szCs w:val="22"/>
         </w:rPr>
-        <w:t xml:space="preserve">Canis </w:t>
-      </w:r>
-      <w:proofErr w:type="spellStart"/>
-      <w:r>
-        <w:rPr>
-          <w:rFonts w:ascii="Arial" w:hAnsi="Arial" w:cs="Arial"/>
-          <w:i/>
-          <w:iCs/>
-          <w:sz w:val="22"/>
-          <w:szCs w:val="22"/>
-        </w:rPr>
-        <w:t>familiaris</w:t>
-      </w:r>
-      <w:proofErr w:type="spellEnd"/>
-      <w:r>
-        <w:rPr>
-          <w:rFonts w:ascii="Arial" w:hAnsi="Arial" w:cs="Arial"/>
-          <w:sz w:val="22"/>
-          <w:szCs w:val="22"/>
-        </w:rPr>
-        <w:t xml:space="preserve">, while </w:t>
-      </w:r>
-      <w:proofErr w:type="spellStart"/>
-      <w:r>
-        <w:rPr>
-          <w:rFonts w:ascii="Arial" w:hAnsi="Arial" w:cs="Arial"/>
-          <w:sz w:val="22"/>
-          <w:szCs w:val="22"/>
-        </w:rPr>
-        <w:t>v</w:t>
-      </w:r>
-      <w:r>
-        <w:rPr>
-          <w:rFonts w:ascii="Arial" w:hAnsi="Arial" w:cs="Arial"/>
-          <w:sz w:val="22"/>
-          <w:szCs w:val="22"/>
-        </w:rPr>
-        <w:t>avilovian</w:t>
-      </w:r>
-      <w:proofErr w:type="spellEnd"/>
-      <w:r>
-        <w:rPr>
-          <w:rFonts w:ascii="Arial" w:hAnsi="Arial" w:cs="Arial"/>
-          <w:sz w:val="22"/>
-          <w:szCs w:val="22"/>
-        </w:rPr>
-        <w:t xml:space="preserve"> mimicry </w:t>
+        <w:t>Canis familiaris</w:t>
+      </w:r>
+      <w:r>
+        <w:rPr>
+          <w:rFonts w:ascii="Arial" w:hAnsi="Arial" w:cs="Arial"/>
+          <w:sz w:val="22"/>
+          <w:szCs w:val="22"/>
+        </w:rPr>
+        <w:t>, while v</w:t>
+      </w:r>
+      <w:r>
+        <w:rPr>
+          <w:rFonts w:ascii="Arial" w:hAnsi="Arial" w:cs="Arial"/>
+          <w:sz w:val="22"/>
+          <w:szCs w:val="22"/>
+        </w:rPr>
+        <w:t xml:space="preserve">avilovian mimicry </w:t>
       </w:r>
       <w:r>
         <w:rPr>
@@ -3601,25 +3563,7 @@
           <w:sz w:val="22"/>
           <w:szCs w:val="22"/>
         </w:rPr>
-        <w:t xml:space="preserve"> has largely focused on </w:t>
-      </w:r>
-      <w:proofErr w:type="spellStart"/>
-      <w:r>
-        <w:rPr>
-          <w:rFonts w:ascii="Arial" w:hAnsi="Arial" w:cs="Arial"/>
-          <w:sz w:val="22"/>
-          <w:szCs w:val="22"/>
-        </w:rPr>
-        <w:t>aves</w:t>
-      </w:r>
-      <w:proofErr w:type="spellEnd"/>
-      <w:r>
-        <w:rPr>
-          <w:rFonts w:ascii="Arial" w:hAnsi="Arial" w:cs="Arial"/>
-          <w:sz w:val="22"/>
-          <w:szCs w:val="22"/>
-        </w:rPr>
-        <w:t xml:space="preserve"> to date</w:t>
+        <w:t xml:space="preserve"> has largely focused on aves to date</w:t>
       </w:r>
       <w:r>
         <w:rPr>
@@ -3940,25 +3884,7 @@
           <w:sz w:val="22"/>
           <w:szCs w:val="22"/>
         </w:rPr>
-        <w:t xml:space="preserve"> a paper was required to </w:t>
-      </w:r>
-      <w:proofErr w:type="spellStart"/>
-      <w:r>
-        <w:rPr>
-          <w:rFonts w:ascii="Arial" w:hAnsi="Arial" w:cs="Arial"/>
-          <w:sz w:val="22"/>
-          <w:szCs w:val="22"/>
-        </w:rPr>
-        <w:t>i</w:t>
-      </w:r>
-      <w:proofErr w:type="spellEnd"/>
-      <w:r>
-        <w:rPr>
-          <w:rFonts w:ascii="Arial" w:hAnsi="Arial" w:cs="Arial"/>
-          <w:sz w:val="22"/>
-          <w:szCs w:val="22"/>
-        </w:rPr>
-        <w:t xml:space="preserve">) focus on mammals, ii) offer a measure of relative </w:t>
+        <w:t xml:space="preserve"> a paper was required to i) focus on mammals, ii) offer a measure of relative </w:t>
       </w:r>
       <w:r>
         <w:rPr>
@@ -4066,43 +3992,7 @@
           <w:sz w:val="22"/>
           <w:szCs w:val="22"/>
         </w:rPr>
-        <w:t xml:space="preserve">((urban-rural comparison OR urbanisation gradient OR urbanization gradient) AND (mammal OR mammalian OR primate OR monkey OR feline OR </w:t>
-      </w:r>
-      <w:proofErr w:type="spellStart"/>
-      <w:r>
-        <w:rPr>
-          <w:rFonts w:ascii="Arial" w:hAnsi="Arial" w:cs="Arial"/>
-          <w:sz w:val="22"/>
-          <w:szCs w:val="22"/>
-        </w:rPr>
-        <w:t>felinae</w:t>
-      </w:r>
-      <w:proofErr w:type="spellEnd"/>
-      <w:r>
-        <w:rPr>
-          <w:rFonts w:ascii="Arial" w:hAnsi="Arial" w:cs="Arial"/>
-          <w:sz w:val="22"/>
-          <w:szCs w:val="22"/>
-        </w:rPr>
-        <w:t xml:space="preserve"> OR </w:t>
-      </w:r>
-      <w:proofErr w:type="spellStart"/>
-      <w:r>
-        <w:rPr>
-          <w:rFonts w:ascii="Arial" w:hAnsi="Arial" w:cs="Arial"/>
-          <w:sz w:val="22"/>
-          <w:szCs w:val="22"/>
-        </w:rPr>
-        <w:t>felidae</w:t>
-      </w:r>
-      <w:proofErr w:type="spellEnd"/>
-      <w:r>
-        <w:rPr>
-          <w:rFonts w:ascii="Arial" w:hAnsi="Arial" w:cs="Arial"/>
-          <w:sz w:val="22"/>
-          <w:szCs w:val="22"/>
-        </w:rPr>
-        <w:t xml:space="preserve"> OR canine OR racoon OR coyote OR fox OR rat) AND (cranial morphology OR braincase OR brain volume OR cranial volume OR cranial capacity))</w:t>
+        <w:t>((urban-rural comparison OR urbanisation gradient OR urbanization gradient) AND (mammal OR mammalian OR primate OR monkey OR feline OR felinae OR felidae OR canine OR racoon OR coyote OR fox OR rat) AND (cranial morphology OR braincase OR brain volume OR cranial volume OR cranial capacity))</w:t>
       </w:r>
     </w:p>
     <w:p>
@@ -5121,25 +5011,7 @@
           <w:sz w:val="22"/>
           <w:szCs w:val="22"/>
         </w:rPr>
-        <w:t xml:space="preserve">specimens from </w:t>
-      </w:r>
-      <w:proofErr w:type="spellStart"/>
-      <w:r>
-        <w:rPr>
-          <w:rFonts w:ascii="Arial" w:hAnsi="Arial" w:cs="Arial"/>
-          <w:sz w:val="22"/>
-          <w:szCs w:val="22"/>
-        </w:rPr>
-        <w:t>DePascal</w:t>
-      </w:r>
-      <w:proofErr w:type="spellEnd"/>
-      <w:r>
-        <w:rPr>
-          <w:rFonts w:ascii="Arial" w:hAnsi="Arial" w:cs="Arial"/>
-          <w:sz w:val="22"/>
-          <w:szCs w:val="22"/>
-        </w:rPr>
-        <w:t xml:space="preserve"> and Snell-Rood</w:t>
+        <w:t>specimens from DePascal and Snell-Rood</w:t>
       </w:r>
       <w:r>
         <w:rPr>
@@ -5367,25 +5239,7 @@
           <w:sz w:val="22"/>
           <w:szCs w:val="22"/>
         </w:rPr>
-        <w:t xml:space="preserve">used the </w:t>
-      </w:r>
-      <w:proofErr w:type="spellStart"/>
-      <w:r>
-        <w:rPr>
-          <w:rFonts w:ascii="Arial" w:hAnsi="Arial" w:cs="Arial"/>
-          <w:sz w:val="22"/>
-          <w:szCs w:val="22"/>
-        </w:rPr>
-        <w:t>effsize</w:t>
-      </w:r>
-      <w:proofErr w:type="spellEnd"/>
-      <w:r>
-        <w:rPr>
-          <w:rFonts w:ascii="Arial" w:hAnsi="Arial" w:cs="Arial"/>
-          <w:sz w:val="22"/>
-          <w:szCs w:val="22"/>
-        </w:rPr>
-        <w:t xml:space="preserve"> package to compute</w:t>
+        <w:t>used the effsize package to compute</w:t>
       </w:r>
       <w:r>
         <w:rPr>
@@ -5738,25 +5592,7 @@
           <w:sz w:val="22"/>
           <w:szCs w:val="22"/>
         </w:rPr>
-        <w:t xml:space="preserve">three models in the </w:t>
-      </w:r>
-      <w:proofErr w:type="spellStart"/>
-      <w:r>
-        <w:rPr>
-          <w:rFonts w:ascii="Arial" w:hAnsi="Arial" w:cs="Arial"/>
-          <w:sz w:val="22"/>
-          <w:szCs w:val="22"/>
-        </w:rPr>
-        <w:t>metafor</w:t>
-      </w:r>
-      <w:proofErr w:type="spellEnd"/>
-      <w:r>
-        <w:rPr>
-          <w:rFonts w:ascii="Arial" w:hAnsi="Arial" w:cs="Arial"/>
-          <w:sz w:val="22"/>
-          <w:szCs w:val="22"/>
-        </w:rPr>
-        <w:t xml:space="preserve"> package </w:t>
+        <w:t xml:space="preserve">three models in the metafor package </w:t>
       </w:r>
       <w:r>
         <w:rPr>
@@ -5787,23 +5623,7 @@
           <w:rFonts w:ascii="Arial" w:hAnsi="Arial" w:cs="Arial"/>
           <w:sz w:val="22"/>
         </w:rPr>
-        <w:t>(</w:t>
-      </w:r>
-      <w:proofErr w:type="spellStart"/>
-      <w:r>
-        <w:rPr>
-          <w:rFonts w:ascii="Arial" w:hAnsi="Arial" w:cs="Arial"/>
-          <w:sz w:val="22"/>
-        </w:rPr>
-        <w:t>Viechtbauer</w:t>
-      </w:r>
-      <w:proofErr w:type="spellEnd"/>
-      <w:r>
-        <w:rPr>
-          <w:rFonts w:ascii="Arial" w:hAnsi="Arial" w:cs="Arial"/>
-          <w:sz w:val="22"/>
-        </w:rPr>
-        <w:t>, 2010)</w:t>
+        <w:t>(Viechtbauer, 2010)</w:t>
       </w:r>
       <w:r>
         <w:rPr>
@@ -6004,20 +5824,8 @@
           <w:sz w:val="22"/>
           <w:szCs w:val="22"/>
         </w:rPr>
-        <w:t xml:space="preserve">Procyon </w:t>
-      </w:r>
-      <w:proofErr w:type="spellStart"/>
-      <w:r>
-        <w:rPr>
-          <w:rFonts w:ascii="Arial" w:hAnsi="Arial" w:cs="Arial"/>
-          <w:i/>
-          <w:iCs/>
-          <w:sz w:val="22"/>
-          <w:szCs w:val="22"/>
-        </w:rPr>
-        <w:t>loctor</w:t>
-      </w:r>
-      <w:proofErr w:type="spellEnd"/>
+        <w:t>Procyon loctor</w:t>
+      </w:r>
       <w:r>
         <w:rPr>
           <w:rFonts w:ascii="Arial" w:hAnsi="Arial" w:cs="Arial"/>
@@ -6383,19 +6191,8 @@
                 <w:iCs/>
                 <w:color w:val="000000"/>
               </w:rPr>
-              <w:t xml:space="preserve">Blarina </w:t>
-            </w:r>
-            <w:proofErr w:type="spellStart"/>
-            <w:r>
-              <w:rPr>
-                <w:rFonts w:ascii="Arial" w:hAnsi="Arial" w:cs="Arial"/>
-                <w:i/>
-                <w:iCs/>
-                <w:color w:val="000000"/>
-              </w:rPr>
-              <w:t>brevicuada</w:t>
-            </w:r>
-            <w:proofErr w:type="spellEnd"/>
+              <w:t>Blarina brevicuada</w:t>
+            </w:r>
           </w:p>
         </w:tc>
         <w:tc>
@@ -6770,19 +6567,8 @@
                 <w:iCs/>
                 <w:color w:val="000000"/>
               </w:rPr>
-              <w:t xml:space="preserve">Microtus </w:t>
-            </w:r>
-            <w:proofErr w:type="spellStart"/>
-            <w:r>
-              <w:rPr>
-                <w:rFonts w:ascii="Arial" w:hAnsi="Arial" w:cs="Arial"/>
-                <w:i/>
-                <w:iCs/>
-                <w:color w:val="000000"/>
-              </w:rPr>
-              <w:t>pennsylvanicus</w:t>
-            </w:r>
-            <w:proofErr w:type="spellEnd"/>
+              <w:t>Microtus pennsylvanicus</w:t>
+            </w:r>
           </w:p>
         </w:tc>
         <w:tc>
@@ -6969,19 +6755,8 @@
                 <w:iCs/>
                 <w:color w:val="000000"/>
               </w:rPr>
-              <w:t xml:space="preserve">Peromyscus </w:t>
-            </w:r>
-            <w:proofErr w:type="spellStart"/>
-            <w:r>
-              <w:rPr>
-                <w:rFonts w:ascii="Arial" w:hAnsi="Arial" w:cs="Arial"/>
-                <w:i/>
-                <w:iCs/>
-                <w:color w:val="000000"/>
-              </w:rPr>
-              <w:t>leucopus</w:t>
-            </w:r>
-            <w:proofErr w:type="spellEnd"/>
+              <w:t>Peromyscus leucopus</w:t>
+            </w:r>
           </w:p>
         </w:tc>
         <w:tc>
@@ -7168,19 +6943,8 @@
                 <w:iCs/>
                 <w:color w:val="000000"/>
               </w:rPr>
-              <w:t xml:space="preserve">Blarina </w:t>
-            </w:r>
-            <w:proofErr w:type="spellStart"/>
-            <w:r>
-              <w:rPr>
-                <w:rFonts w:ascii="Arial" w:hAnsi="Arial" w:cs="Arial"/>
-                <w:i/>
-                <w:iCs/>
-                <w:color w:val="000000"/>
-              </w:rPr>
-              <w:t>brevicuada</w:t>
-            </w:r>
-            <w:proofErr w:type="spellEnd"/>
+              <w:t>Blarina brevicuada</w:t>
+            </w:r>
           </w:p>
         </w:tc>
         <w:tc>
@@ -7360,7 +7124,6 @@
                 <w:color w:val="000000"/>
               </w:rPr>
             </w:pPr>
-            <w:proofErr w:type="spellStart"/>
             <w:r>
               <w:rPr>
                 <w:rFonts w:ascii="Arial" w:hAnsi="Arial" w:cs="Arial"/>
@@ -7368,29 +7131,8 @@
                 <w:iCs/>
                 <w:color w:val="000000"/>
               </w:rPr>
-              <w:t>Clethrionomys</w:t>
-            </w:r>
-            <w:proofErr w:type="spellEnd"/>
-            <w:r>
-              <w:rPr>
-                <w:rFonts w:ascii="Arial" w:hAnsi="Arial" w:cs="Arial"/>
-                <w:i/>
-                <w:iCs/>
-                <w:color w:val="000000"/>
-              </w:rPr>
-              <w:t xml:space="preserve"> </w:t>
-            </w:r>
-            <w:proofErr w:type="spellStart"/>
-            <w:r>
-              <w:rPr>
-                <w:rFonts w:ascii="Arial" w:hAnsi="Arial" w:cs="Arial"/>
-                <w:i/>
-                <w:iCs/>
-                <w:color w:val="000000"/>
-              </w:rPr>
-              <w:t>gapperi</w:t>
-            </w:r>
-            <w:proofErr w:type="spellEnd"/>
+              <w:t>Clethrionomys gapperi</w:t>
+            </w:r>
           </w:p>
         </w:tc>
         <w:tc>
@@ -7758,7 +7500,6 @@
                 <w:color w:val="000000"/>
               </w:rPr>
             </w:pPr>
-            <w:proofErr w:type="spellStart"/>
             <w:r>
               <w:rPr>
                 <w:rFonts w:ascii="Arial" w:hAnsi="Arial" w:cs="Arial"/>
@@ -7766,29 +7507,8 @@
                 <w:iCs/>
                 <w:color w:val="000000"/>
               </w:rPr>
-              <w:t>Geomys</w:t>
-            </w:r>
-            <w:proofErr w:type="spellEnd"/>
-            <w:r>
-              <w:rPr>
-                <w:rFonts w:ascii="Arial" w:hAnsi="Arial" w:cs="Arial"/>
-                <w:i/>
-                <w:iCs/>
-                <w:color w:val="000000"/>
-              </w:rPr>
-              <w:t xml:space="preserve"> </w:t>
-            </w:r>
-            <w:proofErr w:type="spellStart"/>
-            <w:r>
-              <w:rPr>
-                <w:rFonts w:ascii="Arial" w:hAnsi="Arial" w:cs="Arial"/>
-                <w:i/>
-                <w:iCs/>
-                <w:color w:val="000000"/>
-              </w:rPr>
-              <w:t>bursarius</w:t>
-            </w:r>
-            <w:proofErr w:type="spellEnd"/>
+              <w:t>Geomys bursarius</w:t>
+            </w:r>
           </w:p>
         </w:tc>
         <w:tc>
@@ -7975,19 +7695,8 @@
                 <w:iCs/>
                 <w:color w:val="000000"/>
               </w:rPr>
-              <w:t xml:space="preserve">Myotis </w:t>
-            </w:r>
-            <w:proofErr w:type="spellStart"/>
-            <w:r>
-              <w:rPr>
-                <w:rFonts w:ascii="Arial" w:hAnsi="Arial" w:cs="Arial"/>
-                <w:i/>
-                <w:iCs/>
-                <w:color w:val="000000"/>
-              </w:rPr>
-              <w:t>lucifugus</w:t>
-            </w:r>
-            <w:proofErr w:type="spellEnd"/>
+              <w:t>Myotis lucifugus</w:t>
+            </w:r>
           </w:p>
         </w:tc>
         <w:tc>
@@ -8174,19 +7883,8 @@
                 <w:iCs/>
                 <w:color w:val="000000"/>
               </w:rPr>
-              <w:t xml:space="preserve">Microtus </w:t>
-            </w:r>
-            <w:proofErr w:type="spellStart"/>
-            <w:r>
-              <w:rPr>
-                <w:rFonts w:ascii="Arial" w:hAnsi="Arial" w:cs="Arial"/>
-                <w:i/>
-                <w:iCs/>
-                <w:color w:val="000000"/>
-              </w:rPr>
-              <w:t>pennsylvanicus</w:t>
-            </w:r>
-            <w:proofErr w:type="spellEnd"/>
+              <w:t>Microtus pennsylvanicus</w:t>
+            </w:r>
           </w:p>
         </w:tc>
         <w:tc>
@@ -8373,19 +8071,8 @@
                 <w:iCs/>
                 <w:color w:val="000000"/>
               </w:rPr>
-              <w:t xml:space="preserve">Peromyscus </w:t>
-            </w:r>
-            <w:proofErr w:type="spellStart"/>
-            <w:r>
-              <w:rPr>
-                <w:rFonts w:ascii="Arial" w:hAnsi="Arial" w:cs="Arial"/>
-                <w:i/>
-                <w:iCs/>
-                <w:color w:val="000000"/>
-              </w:rPr>
-              <w:t>leucopus</w:t>
-            </w:r>
-            <w:proofErr w:type="spellEnd"/>
+              <w:t>Peromyscus leucopus</w:t>
+            </w:r>
           </w:p>
         </w:tc>
         <w:tc>
@@ -8565,7 +8252,6 @@
                 <w:color w:val="000000"/>
               </w:rPr>
             </w:pPr>
-            <w:proofErr w:type="spellStart"/>
             <w:r>
               <w:rPr>
                 <w:rFonts w:ascii="Arial" w:hAnsi="Arial" w:cs="Arial"/>
@@ -8573,17 +8259,7 @@
                 <w:iCs/>
                 <w:color w:val="000000"/>
               </w:rPr>
-              <w:t>Scuirus</w:t>
-            </w:r>
-            <w:proofErr w:type="spellEnd"/>
-            <w:r>
-              <w:rPr>
-                <w:rFonts w:ascii="Arial" w:hAnsi="Arial" w:cs="Arial"/>
-                <w:i/>
-                <w:iCs/>
-                <w:color w:val="000000"/>
-              </w:rPr>
-              <w:t xml:space="preserve"> carolinensis</w:t>
+              <w:t>Scuirus carolinensis</w:t>
             </w:r>
           </w:p>
         </w:tc>
@@ -8952,7 +8628,6 @@
                 <w:color w:val="000000"/>
               </w:rPr>
             </w:pPr>
-            <w:proofErr w:type="spellStart"/>
             <w:r>
               <w:rPr>
                 <w:rFonts w:ascii="Arial" w:hAnsi="Arial" w:cs="Arial"/>
@@ -8960,29 +8635,8 @@
                 <w:iCs/>
                 <w:color w:val="000000"/>
               </w:rPr>
-              <w:t>Tamiasciurus</w:t>
-            </w:r>
-            <w:proofErr w:type="spellEnd"/>
-            <w:r>
-              <w:rPr>
-                <w:rFonts w:ascii="Arial" w:hAnsi="Arial" w:cs="Arial"/>
-                <w:i/>
-                <w:iCs/>
-                <w:color w:val="000000"/>
-              </w:rPr>
-              <w:t xml:space="preserve"> </w:t>
-            </w:r>
-            <w:proofErr w:type="spellStart"/>
-            <w:r>
-              <w:rPr>
-                <w:rFonts w:ascii="Arial" w:hAnsi="Arial" w:cs="Arial"/>
-                <w:i/>
-                <w:iCs/>
-                <w:color w:val="000000"/>
-              </w:rPr>
-              <w:t>hudsonicus</w:t>
-            </w:r>
-            <w:proofErr w:type="spellEnd"/>
+              <w:t>Tamiasciurus hudsonicus</w:t>
+            </w:r>
           </w:p>
         </w:tc>
         <w:tc>
@@ -9169,19 +8823,8 @@
                 <w:iCs/>
                 <w:color w:val="000000"/>
               </w:rPr>
-              <w:t xml:space="preserve">Procyon </w:t>
-            </w:r>
-            <w:proofErr w:type="spellStart"/>
-            <w:r>
-              <w:rPr>
-                <w:rFonts w:ascii="Arial" w:hAnsi="Arial" w:cs="Arial"/>
-                <w:i/>
-                <w:iCs/>
-                <w:color w:val="000000"/>
-              </w:rPr>
-              <w:t>loctor</w:t>
-            </w:r>
-            <w:proofErr w:type="spellEnd"/>
+              <w:t>Procyon loctor</w:t>
+            </w:r>
           </w:p>
         </w:tc>
         <w:tc>
@@ -9368,19 +9011,8 @@
                 <w:iCs/>
                 <w:color w:val="000000"/>
               </w:rPr>
-              <w:t xml:space="preserve">Procyon </w:t>
-            </w:r>
-            <w:proofErr w:type="spellStart"/>
-            <w:r>
-              <w:rPr>
-                <w:rFonts w:ascii="Arial" w:hAnsi="Arial" w:cs="Arial"/>
-                <w:i/>
-                <w:iCs/>
-                <w:color w:val="000000"/>
-              </w:rPr>
-              <w:t>loctor</w:t>
-            </w:r>
-            <w:proofErr w:type="spellEnd"/>
+              <w:t>Procyon loctor</w:t>
+            </w:r>
           </w:p>
         </w:tc>
         <w:tc>
@@ -9567,19 +9199,8 @@
                 <w:iCs/>
                 <w:color w:val="000000"/>
               </w:rPr>
-              <w:t xml:space="preserve">Procyon </w:t>
-            </w:r>
-            <w:proofErr w:type="spellStart"/>
-            <w:r>
-              <w:rPr>
-                <w:rFonts w:ascii="Arial" w:hAnsi="Arial" w:cs="Arial"/>
-                <w:i/>
-                <w:iCs/>
-                <w:color w:val="000000"/>
-              </w:rPr>
-              <w:t>loctor</w:t>
-            </w:r>
-            <w:proofErr w:type="spellEnd"/>
+              <w:t>Procyon loctor</w:t>
+            </w:r>
           </w:p>
         </w:tc>
         <w:tc>
@@ -9766,19 +9387,8 @@
                 <w:iCs/>
                 <w:color w:val="000000"/>
               </w:rPr>
-              <w:t xml:space="preserve">Procyon </w:t>
-            </w:r>
-            <w:proofErr w:type="spellStart"/>
-            <w:r>
-              <w:rPr>
-                <w:rFonts w:ascii="Arial" w:hAnsi="Arial" w:cs="Arial"/>
-                <w:i/>
-                <w:iCs/>
-                <w:color w:val="000000"/>
-              </w:rPr>
-              <w:t>loctor</w:t>
-            </w:r>
-            <w:proofErr w:type="spellEnd"/>
+              <w:t>Procyon loctor</w:t>
+            </w:r>
           </w:p>
         </w:tc>
         <w:tc>
@@ -10258,20 +9868,8 @@
           <w:sz w:val="22"/>
           <w:szCs w:val="22"/>
         </w:rPr>
-        <w:t xml:space="preserve">Procyon </w:t>
-      </w:r>
-      <w:proofErr w:type="spellStart"/>
-      <w:r>
-        <w:rPr>
-          <w:rFonts w:ascii="Arial" w:hAnsi="Arial" w:cs="Arial"/>
-          <w:i/>
-          <w:iCs/>
-          <w:sz w:val="22"/>
-          <w:szCs w:val="22"/>
-        </w:rPr>
-        <w:t>loctor</w:t>
-      </w:r>
-      <w:proofErr w:type="spellEnd"/>
+        <w:t>Procyon loctor</w:t>
+      </w:r>
       <w:r>
         <w:rPr>
           <w:rFonts w:ascii="Arial" w:hAnsi="Arial" w:cs="Arial"/>
@@ -10318,7 +9916,7 @@
           <w:sz w:val="22"/>
           <w:szCs w:val="22"/>
         </w:rPr>
-        <w:t>. However, as before, confidence intervals crossed zero for all but one of these</w:t>
+        <w:t xml:space="preserve"> However, as before, confidence intervals crossed zero for all but one of these</w:t>
       </w:r>
       <w:r>
         <w:rPr>
@@ -10730,23 +10328,7 @@
           <w:rFonts w:ascii="Arial" w:hAnsi="Arial" w:cs="Arial"/>
           <w:sz w:val="22"/>
         </w:rPr>
-        <w:t xml:space="preserve"> (2021) ‘Ivory poaching and the rapid evolution of </w:t>
-      </w:r>
-      <w:proofErr w:type="spellStart"/>
-      <w:r>
-        <w:rPr>
-          <w:rFonts w:ascii="Arial" w:hAnsi="Arial" w:cs="Arial"/>
-          <w:sz w:val="22"/>
-        </w:rPr>
-        <w:t>tusklessness</w:t>
-      </w:r>
-      <w:proofErr w:type="spellEnd"/>
-      <w:r>
-        <w:rPr>
-          <w:rFonts w:ascii="Arial" w:hAnsi="Arial" w:cs="Arial"/>
-          <w:sz w:val="22"/>
-        </w:rPr>
-        <w:t xml:space="preserve"> in African elephants’, </w:t>
+        <w:t xml:space="preserve"> (2021) ‘Ivory poaching and the rapid evolution of tusklessness in African elephants’, </w:t>
       </w:r>
       <w:r>
         <w:rPr>
@@ -10906,23 +10488,7 @@
           <w:rFonts w:ascii="Arial" w:hAnsi="Arial" w:cs="Arial"/>
           <w:sz w:val="22"/>
         </w:rPr>
-        <w:t xml:space="preserve">Freedman, A.H., </w:t>
-      </w:r>
-      <w:proofErr w:type="spellStart"/>
-      <w:r>
-        <w:rPr>
-          <w:rFonts w:ascii="Arial" w:hAnsi="Arial" w:cs="Arial"/>
-          <w:sz w:val="22"/>
-        </w:rPr>
-        <w:t>Lohmueller</w:t>
-      </w:r>
-      <w:proofErr w:type="spellEnd"/>
-      <w:r>
-        <w:rPr>
-          <w:rFonts w:ascii="Arial" w:hAnsi="Arial" w:cs="Arial"/>
-          <w:sz w:val="22"/>
-        </w:rPr>
-        <w:t xml:space="preserve">, K.E. and Wayne, R.K. (2016) ‘Evolutionary History, Selective Sweeps, and Deleterious Variation in the Dog’, </w:t>
+        <w:t xml:space="preserve">Freedman, A.H., Lohmueller, K.E. and Wayne, R.K. (2016) ‘Evolutionary History, Selective Sweeps, and Deleterious Variation in the Dog’, </w:t>
       </w:r>
       <w:r>
         <w:rPr>
@@ -11101,7 +10667,6 @@
         </w:rPr>
         <w:t xml:space="preserve">, </w:t>
       </w:r>
-      <w:proofErr w:type="spellStart"/>
       <w:r>
         <w:rPr>
           <w:rFonts w:ascii="Arial" w:hAnsi="Arial" w:cs="Arial"/>
@@ -11111,7 +10676,6 @@
         </w:rPr>
         <w:t>BioRender</w:t>
       </w:r>
-      <w:proofErr w:type="spellEnd"/>
       <w:r>
         <w:rPr>
           <w:rFonts w:ascii="Arial" w:hAnsi="Arial" w:cs="Arial"/>
@@ -11341,23 +10905,7 @@
           <w:rFonts w:ascii="Arial" w:hAnsi="Arial" w:cs="Arial"/>
           <w:sz w:val="22"/>
         </w:rPr>
-        <w:t xml:space="preserve">Regacho, T. and </w:t>
-      </w:r>
-      <w:proofErr w:type="spellStart"/>
-      <w:r>
-        <w:rPr>
-          <w:rFonts w:ascii="Arial" w:hAnsi="Arial" w:cs="Arial"/>
-          <w:sz w:val="22"/>
-        </w:rPr>
-        <w:t>delBarco</w:t>
-      </w:r>
-      <w:proofErr w:type="spellEnd"/>
-      <w:r>
-        <w:rPr>
-          <w:rFonts w:ascii="Arial" w:hAnsi="Arial" w:cs="Arial"/>
-          <w:sz w:val="22"/>
-        </w:rPr>
-        <w:t>-Trillo, J. (2021) ‘Morphological Stability of Rural Populations Confirms Their Use As Controls in Urban Ecology Studies’. Research Square. Available at: https://doi.org/10.21203/rs.3.rs-795506/v1.</w:t>
+        <w:t>Regacho, T. and delBarco-Trillo, J. (2021) ‘Morphological Stability of Rural Populations Confirms Their Use As Controls in Urban Ecology Studies’. Research Square. Available at: https://doi.org/10.21203/rs.3.rs-795506/v1.</w:t>
       </w:r>
     </w:p>
     <w:p>
@@ -11496,37 +11044,12 @@
           <w:sz w:val="22"/>
         </w:rPr>
       </w:pPr>
-      <w:proofErr w:type="spellStart"/>
-      <w:r>
-        <w:rPr>
-          <w:rFonts w:ascii="Arial" w:hAnsi="Arial" w:cs="Arial"/>
-          <w:sz w:val="22"/>
-        </w:rPr>
-        <w:t>Torchiano</w:t>
-      </w:r>
-      <w:proofErr w:type="spellEnd"/>
-      <w:r>
-        <w:rPr>
-          <w:rFonts w:ascii="Arial" w:hAnsi="Arial" w:cs="Arial"/>
-          <w:sz w:val="22"/>
-        </w:rPr>
-        <w:t>, M. (2020) ‘</w:t>
-      </w:r>
-      <w:proofErr w:type="spellStart"/>
-      <w:r>
-        <w:rPr>
-          <w:rFonts w:ascii="Arial" w:hAnsi="Arial" w:cs="Arial"/>
-          <w:sz w:val="22"/>
-        </w:rPr>
-        <w:t>effsize</w:t>
-      </w:r>
-      <w:proofErr w:type="spellEnd"/>
-      <w:r>
-        <w:rPr>
-          <w:rFonts w:ascii="Arial" w:hAnsi="Arial" w:cs="Arial"/>
-          <w:sz w:val="22"/>
-        </w:rPr>
-        <w:t>: Efficient Effect Size Computation’. Available at: https://cran.r-project.org/web/packages/effsize/index.html (Accessed: 6 April 2026).</w:t>
+      <w:r>
+        <w:rPr>
+          <w:rFonts w:ascii="Arial" w:hAnsi="Arial" w:cs="Arial"/>
+          <w:sz w:val="22"/>
+        </w:rPr>
+        <w:t>Torchiano, M. (2020) ‘effsize: Efficient Effect Size Computation’. Available at: https://cran.r-project.org/web/packages/effsize/index.html (Accessed: 6 April 2026).</w:t>
       </w:r>
     </w:p>
     <w:p>
@@ -11537,37 +11060,12 @@
           <w:sz w:val="22"/>
         </w:rPr>
       </w:pPr>
-      <w:proofErr w:type="spellStart"/>
-      <w:r>
-        <w:rPr>
-          <w:rFonts w:ascii="Arial" w:hAnsi="Arial" w:cs="Arial"/>
-          <w:sz w:val="22"/>
-        </w:rPr>
-        <w:t>Viechtbauer</w:t>
-      </w:r>
-      <w:proofErr w:type="spellEnd"/>
-      <w:r>
-        <w:rPr>
-          <w:rFonts w:ascii="Arial" w:hAnsi="Arial" w:cs="Arial"/>
-          <w:sz w:val="22"/>
-        </w:rPr>
-        <w:t xml:space="preserve">, W. (2010) ‘Conducting Meta-Analyses in R with the </w:t>
-      </w:r>
-      <w:proofErr w:type="spellStart"/>
-      <w:r>
-        <w:rPr>
-          <w:rFonts w:ascii="Arial" w:hAnsi="Arial" w:cs="Arial"/>
-          <w:sz w:val="22"/>
-        </w:rPr>
-        <w:t>metafor</w:t>
-      </w:r>
-      <w:proofErr w:type="spellEnd"/>
-      <w:r>
-        <w:rPr>
-          <w:rFonts w:ascii="Arial" w:hAnsi="Arial" w:cs="Arial"/>
-          <w:sz w:val="22"/>
-        </w:rPr>
-        <w:t xml:space="preserve"> Package’, </w:t>
+      <w:r>
+        <w:rPr>
+          <w:rFonts w:ascii="Arial" w:hAnsi="Arial" w:cs="Arial"/>
+          <w:sz w:val="22"/>
+        </w:rPr>
+        <w:t xml:space="preserve">Viechtbauer, W. (2010) ‘Conducting Meta-Analyses in R with the metafor Package’, </w:t>
       </w:r>
       <w:r>
         <w:rPr>
@@ -11599,23 +11097,7 @@
           <w:rFonts w:ascii="Arial" w:hAnsi="Arial" w:cs="Arial"/>
           <w:sz w:val="22"/>
         </w:rPr>
-        <w:t xml:space="preserve">Wilkins, A.S., Wrangham, R.W. and Fitch, W.T. (2014) ‘The “Domestication Syndrome” in Mammals: A Unified Explanation Based on Neural Crest Cell </w:t>
-      </w:r>
-      <w:proofErr w:type="spellStart"/>
-      <w:r>
-        <w:rPr>
-          <w:rFonts w:ascii="Arial" w:hAnsi="Arial" w:cs="Arial"/>
-          <w:sz w:val="22"/>
-        </w:rPr>
-        <w:t>Behavior</w:t>
-      </w:r>
-      <w:proofErr w:type="spellEnd"/>
-      <w:r>
-        <w:rPr>
-          <w:rFonts w:ascii="Arial" w:hAnsi="Arial" w:cs="Arial"/>
-          <w:sz w:val="22"/>
-        </w:rPr>
-        <w:t xml:space="preserve"> and Genetics’, </w:t>
+        <w:t xml:space="preserve">Wilkins, A.S., Wrangham, R.W. and Fitch, W.T. (2014) ‘The “Domestication Syndrome” in Mammals: A Unified Explanation Based on Neural Crest Cell Behavior and Genetics’, </w:t>
       </w:r>
       <w:r>
         <w:rPr>
@@ -12489,6 +11971,7 @@
   <w:style w:type="character" w:default="1" w:styleId="DefaultParagraphFont">
     <w:name w:val="Default Paragraph Font"/>
     <w:uiPriority w:val="1"/>
+    <w:semiHidden/>
     <w:unhideWhenUsed/>
   </w:style>
   <w:style w:type="table" w:default="1" w:styleId="TableNormal">
@@ -13275,6 +12758,8 @@
     <w:rsid w:val="00886560"/>
     <w:rsid w:val="008B51A8"/>
     <w:rsid w:val="009A5A43"/>
+    <w:rsid w:val="00AE1665"/>
+    <w:rsid w:val="00B841C2"/>
     <w:rsid w:val="00BC5197"/>
     <w:rsid w:val="00C72DE4"/>
     <w:rsid w:val="00DA7A95"/>

</xml_diff>

<commit_message>
more faffing and writing
</commit_message>
<xml_diff>
--- a/write_up/Trends in Cranial Capacity of urban-rural mammals.docx
+++ b/write_up/Trends in Cranial Capacity of urban-rural mammals.docx
@@ -806,26 +806,42 @@
             <w:r>
               <w:rPr>
                 <w:rFonts w:ascii="Arial Black" w:hAnsi="Arial Black"/>
+                <w:sz w:val="16"/>
+                <w:szCs w:val="16"/>
               </w:rPr>
               <w:t>Elm</w:t>
             </w:r>
             <w:r>
               <w:rPr>
                 <w:rFonts w:ascii="Arial Black" w:hAnsi="Arial Black"/>
+                <w:sz w:val="16"/>
+                <w:szCs w:val="16"/>
               </w:rPr>
               <w:t xml:space="preserve"> 4o</w:t>
             </w:r>
             <w:r>
               <w:rPr>
                 <w:rFonts w:ascii="Arial Black" w:hAnsi="Arial Black"/>
+                <w:sz w:val="16"/>
+                <w:szCs w:val="16"/>
               </w:rPr>
               <w:t xml:space="preserve"> was used to assist with R code for data cleaning</w:t>
             </w:r>
             <w:r>
               <w:rPr>
                 <w:rFonts w:ascii="Arial Black" w:hAnsi="Arial Black"/>
+                <w:sz w:val="16"/>
+                <w:szCs w:val="16"/>
               </w:rPr>
               <w:t xml:space="preserve"> for one paper</w:t>
+            </w:r>
+            <w:r>
+              <w:rPr>
+                <w:rFonts w:ascii="Arial Black" w:hAnsi="Arial Black"/>
+                <w:sz w:val="16"/>
+                <w:szCs w:val="16"/>
+              </w:rPr>
+              <w:t>, and for inspiration on dealing with multicollinearity</w:t>
             </w:r>
           </w:p>
         </w:tc>
@@ -1766,7 +1782,7 @@
                 <w:noProof/>
                 <w:webHidden/>
               </w:rPr>
-              <w:t>10</w:t>
+              <w:t>11</w:t>
             </w:r>
             <w:r>
               <w:rPr>
@@ -2024,7 +2040,23 @@
           <w:sz w:val="22"/>
           <w:szCs w:val="22"/>
         </w:rPr>
-        <w:t xml:space="preserve"> synanthropic mammals as they </w:t>
+        <w:t xml:space="preserve"> </w:t>
+      </w:r>
+      <w:r>
+        <w:rPr>
+          <w:rFonts w:ascii="Arial" w:hAnsi="Arial" w:cs="Arial"/>
+          <w:sz w:val="22"/>
+          <w:szCs w:val="22"/>
+        </w:rPr>
+        <w:t xml:space="preserve">some </w:t>
+      </w:r>
+      <w:r>
+        <w:rPr>
+          <w:rFonts w:ascii="Arial" w:hAnsi="Arial" w:cs="Arial"/>
+          <w:sz w:val="22"/>
+          <w:szCs w:val="22"/>
+        </w:rPr>
+        <w:t xml:space="preserve">synanthropic mammals as they </w:t>
       </w:r>
       <w:r>
         <w:rPr>
@@ -3821,15 +3853,15 @@
           <w:sz w:val="22"/>
           <w:szCs w:val="22"/>
         </w:rPr>
-        <w:t xml:space="preserve"> terrestrial</w:t>
-      </w:r>
-      <w:r>
-        <w:rPr>
-          <w:rFonts w:ascii="Arial" w:hAnsi="Arial" w:cs="Arial"/>
-          <w:sz w:val="22"/>
-          <w:szCs w:val="22"/>
-        </w:rPr>
-        <w:t xml:space="preserve"> mammals as </w:t>
+        <w:t xml:space="preserve"> </w:t>
+      </w:r>
+      <w:r>
+        <w:rPr>
+          <w:rFonts w:ascii="Arial" w:hAnsi="Arial" w:cs="Arial"/>
+          <w:sz w:val="22"/>
+          <w:szCs w:val="22"/>
+        </w:rPr>
+        <w:t xml:space="preserve">mammals as </w:t>
       </w:r>
       <w:r>
         <w:rPr>
@@ -3845,15 +3877,15 @@
           <w:sz w:val="22"/>
           <w:szCs w:val="22"/>
         </w:rPr>
-        <w:t xml:space="preserve">s well as because they are of higher public interest and </w:t>
-      </w:r>
-      <w:r>
-        <w:rPr>
-          <w:rFonts w:ascii="Arial" w:hAnsi="Arial" w:cs="Arial"/>
-          <w:sz w:val="22"/>
-          <w:szCs w:val="22"/>
-        </w:rPr>
-        <w:t xml:space="preserve">avoid the complication of flight regarding range and proximity to humans. </w:t>
+        <w:t>s well as because they are of higher public interest</w:t>
+      </w:r>
+      <w:r>
+        <w:rPr>
+          <w:rFonts w:ascii="Arial" w:hAnsi="Arial" w:cs="Arial"/>
+          <w:sz w:val="22"/>
+          <w:szCs w:val="22"/>
+        </w:rPr>
+        <w:t xml:space="preserve">. </w:t>
       </w:r>
       <w:r>
         <w:rPr>
@@ -3869,15 +3901,7 @@
           <w:sz w:val="22"/>
           <w:szCs w:val="22"/>
         </w:rPr>
-        <w:t>59</w:t>
-      </w:r>
-      <w:r>
-        <w:rPr>
-          <w:rFonts w:ascii="Arial" w:hAnsi="Arial" w:cs="Arial"/>
-          <w:sz w:val="22"/>
-          <w:szCs w:val="22"/>
-        </w:rPr>
-        <w:t>4</w:t>
+        <w:t>582</w:t>
       </w:r>
       <w:r>
         <w:rPr>
@@ -4323,7 +4347,31 @@
           <w:sz w:val="22"/>
           <w:szCs w:val="22"/>
         </w:rPr>
-        <w:t xml:space="preserve">reviews and non-mammal studies with titles that did not reveal this were excluded, as </w:t>
+        <w:t xml:space="preserve">reviews and non-mammal studies with titles that did not reveal this were excluded, as well as those that did not measure </w:t>
+      </w:r>
+      <w:r>
+        <w:rPr>
+          <w:rFonts w:ascii="Arial" w:hAnsi="Arial" w:cs="Arial"/>
+          <w:sz w:val="22"/>
+          <w:szCs w:val="22"/>
+        </w:rPr>
+        <w:t>CC</w:t>
+      </w:r>
+      <w:r>
+        <w:rPr>
+          <w:rFonts w:ascii="Arial" w:hAnsi="Arial" w:cs="Arial"/>
+          <w:sz w:val="22"/>
+          <w:szCs w:val="22"/>
+        </w:rPr>
+        <w:t xml:space="preserve"> (</w:t>
+      </w:r>
+      <w:r>
+        <w:rPr>
+          <w:rFonts w:ascii="Arial" w:hAnsi="Arial" w:cs="Arial"/>
+          <w:sz w:val="22"/>
+          <w:szCs w:val="22"/>
+        </w:rPr>
+        <w:t xml:space="preserve">one bat paper measured wing length, one fox paper </w:t>
       </w:r>
       <w:r>
         <w:rPr>
@@ -4332,31 +4380,7 @@
           <w:szCs w:val="22"/>
         </w:rPr>
         <w:lastRenderedPageBreak/>
-        <w:t xml:space="preserve">well as those that did not measure </w:t>
-      </w:r>
-      <w:r>
-        <w:rPr>
-          <w:rFonts w:ascii="Arial" w:hAnsi="Arial" w:cs="Arial"/>
-          <w:sz w:val="22"/>
-          <w:szCs w:val="22"/>
-        </w:rPr>
-        <w:t>CC</w:t>
-      </w:r>
-      <w:r>
-        <w:rPr>
-          <w:rFonts w:ascii="Arial" w:hAnsi="Arial" w:cs="Arial"/>
-          <w:sz w:val="22"/>
-          <w:szCs w:val="22"/>
-        </w:rPr>
-        <w:t xml:space="preserve"> (</w:t>
-      </w:r>
-      <w:r>
-        <w:rPr>
-          <w:rFonts w:ascii="Arial" w:hAnsi="Arial" w:cs="Arial"/>
-          <w:sz w:val="22"/>
-          <w:szCs w:val="22"/>
-        </w:rPr>
-        <w:t xml:space="preserve">one bat paper measured wing length, one fox paper focused on facial symmetry). </w:t>
+        <w:t xml:space="preserve">focused on facial symmetry). </w:t>
       </w:r>
       <w:r>
         <w:rPr>
@@ -5247,7 +5271,23 @@
           <w:sz w:val="22"/>
           <w:szCs w:val="22"/>
         </w:rPr>
-        <w:t xml:space="preserve">Where </w:t>
+        <w:t xml:space="preserve">Where urban/rural was given as population percentage urban, I </w:t>
+      </w:r>
+      <w:r>
+        <w:rPr>
+          <w:rFonts w:ascii="Arial" w:hAnsi="Arial" w:cs="Arial"/>
+          <w:sz w:val="22"/>
+          <w:szCs w:val="22"/>
+        </w:rPr>
+        <w:t xml:space="preserve">arbitrarily </w:t>
+      </w:r>
+      <w:r>
+        <w:rPr>
+          <w:rFonts w:ascii="Arial" w:hAnsi="Arial" w:cs="Arial"/>
+          <w:sz w:val="22"/>
+          <w:szCs w:val="22"/>
+        </w:rPr>
+        <w:t xml:space="preserve">designated urban </w:t>
       </w:r>
       <w:r>
         <w:rPr>
@@ -5256,23 +5296,7 @@
           <w:szCs w:val="22"/>
         </w:rPr>
         <w:lastRenderedPageBreak/>
-        <w:t xml:space="preserve">urban/rural was given as population percentage urban, I </w:t>
-      </w:r>
-      <w:r>
-        <w:rPr>
-          <w:rFonts w:ascii="Arial" w:hAnsi="Arial" w:cs="Arial"/>
-          <w:sz w:val="22"/>
-          <w:szCs w:val="22"/>
-        </w:rPr>
-        <w:t xml:space="preserve">arbitrarily </w:t>
-      </w:r>
-      <w:r>
-        <w:rPr>
-          <w:rFonts w:ascii="Arial" w:hAnsi="Arial" w:cs="Arial"/>
-          <w:sz w:val="22"/>
-          <w:szCs w:val="22"/>
-        </w:rPr>
-        <w:t>designated urban specimens as those 50%</w:t>
+        <w:t>specimens as those 50%</w:t>
       </w:r>
       <w:r>
         <w:rPr>
@@ -5525,57 +5549,6 @@
           <w:szCs w:val="22"/>
         </w:rPr>
         <w:t xml:space="preserve">. </w:t>
-      </w:r>
-      <w:r>
-        <w:rPr>
-          <w:rFonts w:ascii="Arial" w:hAnsi="Arial" w:cs="Arial"/>
-          <w:sz w:val="22"/>
-          <w:szCs w:val="22"/>
-        </w:rPr>
-        <w:t>Full code</w:t>
-      </w:r>
-      <w:r>
-        <w:rPr>
-          <w:rFonts w:ascii="Arial" w:hAnsi="Arial" w:cs="Arial"/>
-          <w:sz w:val="22"/>
-          <w:szCs w:val="22"/>
-        </w:rPr>
-        <w:t xml:space="preserve"> and cleaned data </w:t>
-      </w:r>
-      <w:r>
-        <w:rPr>
-          <w:rFonts w:ascii="Arial" w:hAnsi="Arial" w:cs="Arial"/>
-          <w:sz w:val="22"/>
-          <w:szCs w:val="22"/>
-        </w:rPr>
-        <w:t>are</w:t>
-      </w:r>
-      <w:r>
-        <w:rPr>
-          <w:rFonts w:ascii="Arial" w:hAnsi="Arial" w:cs="Arial"/>
-          <w:sz w:val="22"/>
-          <w:szCs w:val="22"/>
-        </w:rPr>
-        <w:t xml:space="preserve"> available at </w:t>
-      </w:r>
-      <w:hyperlink r:id="rId10" w:history="1">
-        <w:r>
-          <w:rPr>
-            <w:rStyle w:val="Hyperlink"/>
-            <w:rFonts w:ascii="Arial" w:hAnsi="Arial" w:cs="Arial"/>
-            <w:sz w:val="22"/>
-            <w:szCs w:val="22"/>
-          </w:rPr>
-          <w:t>https://github.com/estermayk/meta_analysis.git</w:t>
-        </w:r>
-      </w:hyperlink>
-      <w:r>
-        <w:rPr>
-          <w:rFonts w:ascii="Arial" w:hAnsi="Arial" w:cs="Arial"/>
-          <w:sz w:val="22"/>
-          <w:szCs w:val="22"/>
-        </w:rPr>
-        <w:t>.</w:t>
       </w:r>
     </w:p>
     <w:p>
@@ -5611,7 +5584,7 @@
                     <pic:cNvPicPr/>
                   </pic:nvPicPr>
                   <pic:blipFill>
-                    <a:blip r:embed="rId11">
+                    <a:blip r:embed="rId10">
                       <a:extLst>
                         <a:ext uri="{28A0092B-C50C-407E-A947-70E740481C1C}">
                           <a14:useLocalDpi xmlns:a14="http://schemas.microsoft.com/office/drawing/2010/main" val="0"/>
@@ -5671,7 +5644,7 @@
                     <pic:cNvPicPr/>
                   </pic:nvPicPr>
                   <pic:blipFill>
-                    <a:blip r:embed="rId12">
+                    <a:blip r:embed="rId11">
                       <a:extLst>
                         <a:ext uri="{28A0092B-C50C-407E-A947-70E740481C1C}">
                           <a14:useLocalDpi xmlns:a14="http://schemas.microsoft.com/office/drawing/2010/main" val="0"/>
@@ -5731,7 +5704,7 @@
                     <pic:cNvPicPr/>
                   </pic:nvPicPr>
                   <pic:blipFill>
-                    <a:blip r:embed="rId13">
+                    <a:blip r:embed="rId12">
                       <a:extLst>
                         <a:ext uri="{28A0092B-C50C-407E-A947-70E740481C1C}">
                           <a14:useLocalDpi xmlns:a14="http://schemas.microsoft.com/office/drawing/2010/main" val="0"/>
@@ -5991,7 +5964,57 @@
           <w:sz w:val="22"/>
           <w:szCs w:val="22"/>
         </w:rPr>
-        <w:t xml:space="preserve">between papers, and finally </w:t>
+        <w:t>between papers</w:t>
+      </w:r>
+      <w:r>
+        <w:rPr>
+          <w:rFonts w:ascii="Arial" w:hAnsi="Arial" w:cs="Arial"/>
+          <w:sz w:val="22"/>
+          <w:szCs w:val="22"/>
+        </w:rPr>
+        <w:t xml:space="preserve">. </w:t>
+      </w:r>
+    </w:p>
+    <w:p>
+      <w:pPr>
+        <w:spacing w:line="360" w:lineRule="auto"/>
+        <w:rPr>
+          <w:rFonts w:ascii="Arial" w:hAnsi="Arial" w:cs="Arial"/>
+          <w:sz w:val="22"/>
+          <w:szCs w:val="22"/>
+        </w:rPr>
+      </w:pPr>
+      <w:r>
+        <w:rPr>
+          <w:rFonts w:ascii="Arial" w:hAnsi="Arial" w:cs="Arial"/>
+          <w:sz w:val="22"/>
+          <w:szCs w:val="22"/>
+        </w:rPr>
+        <w:t>F</w:t>
+      </w:r>
+      <w:r>
+        <w:rPr>
+          <w:rFonts w:ascii="Arial" w:hAnsi="Arial" w:cs="Arial"/>
+          <w:sz w:val="22"/>
+          <w:szCs w:val="22"/>
+        </w:rPr>
+        <w:t>inally</w:t>
+      </w:r>
+      <w:r>
+        <w:rPr>
+          <w:rFonts w:ascii="Arial" w:hAnsi="Arial" w:cs="Arial"/>
+          <w:sz w:val="22"/>
+          <w:szCs w:val="22"/>
+        </w:rPr>
+        <w:t>, I</w:t>
+      </w:r>
+      <w:r>
+        <w:rPr>
+          <w:rFonts w:ascii="Arial" w:hAnsi="Arial" w:cs="Arial"/>
+          <w:sz w:val="22"/>
+          <w:szCs w:val="22"/>
+        </w:rPr>
+        <w:t xml:space="preserve"> </w:t>
       </w:r>
       <w:r>
         <w:rPr>
@@ -6095,6 +6118,22 @@
           <w:sz w:val="22"/>
           <w:szCs w:val="22"/>
         </w:rPr>
+        <w:t>Ecoregion was releveled to set Plains as the reference as it</w:t>
+      </w:r>
+      <w:r>
+        <w:rPr>
+          <w:rFonts w:ascii="Arial" w:hAnsi="Arial" w:cs="Arial"/>
+          <w:sz w:val="22"/>
+          <w:szCs w:val="22"/>
+        </w:rPr>
+        <w:t xml:space="preserve"> possessed the largest sample size and was therefore the most stable estimate. </w:t>
+      </w:r>
+      <w:r>
+        <w:rPr>
+          <w:rFonts w:ascii="Arial" w:hAnsi="Arial" w:cs="Arial"/>
+          <w:sz w:val="22"/>
+          <w:szCs w:val="22"/>
+        </w:rPr>
         <w:t>Both length and year of first collection were centred</w:t>
       </w:r>
       <w:r>
@@ -6185,21 +6224,66 @@
         </w:rPr>
         <w:t xml:space="preserve">increased multicollinearity. </w:t>
       </w:r>
-      <w:r>
-        <w:rPr>
-          <w:rFonts w:ascii="Arial" w:hAnsi="Arial" w:cs="Arial"/>
-          <w:sz w:val="22"/>
-          <w:szCs w:val="22"/>
-        </w:rPr>
-        <w:t>(7</w:t>
-      </w:r>
-      <w:r>
-        <w:rPr>
-          <w:rFonts w:ascii="Arial" w:hAnsi="Arial" w:cs="Arial"/>
-          <w:sz w:val="22"/>
-          <w:szCs w:val="22"/>
-        </w:rPr>
-        <w:t>79</w:t>
+    </w:p>
+    <w:p>
+      <w:pPr>
+        <w:spacing w:line="360" w:lineRule="auto"/>
+        <w:rPr>
+          <w:rFonts w:ascii="Arial" w:hAnsi="Arial" w:cs="Arial"/>
+          <w:sz w:val="22"/>
+          <w:szCs w:val="22"/>
+        </w:rPr>
+      </w:pPr>
+      <w:r>
+        <w:rPr>
+          <w:rFonts w:ascii="Arial" w:hAnsi="Arial" w:cs="Arial"/>
+          <w:sz w:val="22"/>
+          <w:szCs w:val="22"/>
+        </w:rPr>
+        <w:t xml:space="preserve">Full code and cleaned data are available at </w:t>
+      </w:r>
+      <w:hyperlink r:id="rId13" w:history="1">
+        <w:r>
+          <w:rPr>
+            <w:rStyle w:val="Hyperlink"/>
+            <w:rFonts w:ascii="Arial" w:hAnsi="Arial" w:cs="Arial"/>
+            <w:sz w:val="22"/>
+            <w:szCs w:val="22"/>
+          </w:rPr>
+          <w:t>https://github.com/estermayk/meta_analysis.git</w:t>
+        </w:r>
+      </w:hyperlink>
+      <w:r>
+        <w:rPr>
+          <w:rFonts w:ascii="Arial" w:hAnsi="Arial" w:cs="Arial"/>
+          <w:sz w:val="22"/>
+          <w:szCs w:val="22"/>
+        </w:rPr>
+        <w:t>.</w:t>
+      </w:r>
+      <w:r>
+        <w:rPr>
+          <w:rFonts w:ascii="Arial" w:hAnsi="Arial" w:cs="Arial"/>
+          <w:sz w:val="22"/>
+          <w:szCs w:val="22"/>
+        </w:rPr>
+        <w:t xml:space="preserve"> </w:t>
+      </w:r>
+      <w:r>
+        <w:rPr>
+          <w:rFonts w:ascii="Arial" w:hAnsi="Arial" w:cs="Arial"/>
+          <w:sz w:val="22"/>
+          <w:szCs w:val="22"/>
+        </w:rPr>
+        <w:t>(</w:t>
+      </w:r>
+      <w:r>
+        <w:rPr>
+          <w:rFonts w:ascii="Arial" w:hAnsi="Arial" w:cs="Arial"/>
+          <w:sz w:val="22"/>
+          <w:szCs w:val="22"/>
+        </w:rPr>
+        <w:t>802</w:t>
       </w:r>
       <w:r>
         <w:rPr>
@@ -11740,17 +11824,6 @@
     </w:p>
     <w:p>
       <w:pPr>
-        <w:spacing w:line="360" w:lineRule="auto"/>
-        <w:jc w:val="both"/>
-        <w:rPr>
-          <w:rFonts w:ascii="Arial" w:hAnsi="Arial" w:cs="Arial"/>
-          <w:sz w:val="22"/>
-          <w:szCs w:val="22"/>
-        </w:rPr>
-      </w:pPr>
-    </w:p>
-    <w:p>
-      <w:pPr>
         <w:spacing w:line="240" w:lineRule="auto"/>
         <w:jc w:val="both"/>
         <w:rPr>
@@ -11762,16 +11835,15 @@
       <w:r>
         <w:rPr>
           <w:rFonts w:ascii="Arial" w:hAnsi="Arial" w:cs="Arial"/>
-          <w:noProof/>
-          <w:sz w:val="22"/>
-          <w:szCs w:val="22"/>
+          <w:sz w:val="16"/>
+          <w:szCs w:val="16"/>
         </w:rPr>
         <w:lastRenderedPageBreak/>
         <w:drawing>
-          <wp:inline distT="0" distB="0" distL="0" distR="0" wp14:anchorId="5338C361" wp14:editId="7D82CD3F">
-            <wp:extent cx="5731510" cy="2366645"/>
+          <wp:inline distT="0" distB="0" distL="0" distR="0" wp14:anchorId="40216641" wp14:editId="24BB888B">
+            <wp:extent cx="5731510" cy="2235200"/>
             <wp:effectExtent l="0" t="0" r="2540" b="0"/>
-            <wp:docPr id="163895200" name="Picture 1"/>
+            <wp:docPr id="743836696" name="Picture 1"/>
             <wp:cNvGraphicFramePr>
               <a:graphicFrameLocks xmlns:a="http://schemas.openxmlformats.org/drawingml/2006/main" noChangeAspect="1"/>
             </wp:cNvGraphicFramePr>
@@ -11779,7 +11851,7 @@
               <a:graphicData uri="http://schemas.openxmlformats.org/drawingml/2006/picture">
                 <pic:pic xmlns:pic="http://schemas.openxmlformats.org/drawingml/2006/picture">
                   <pic:nvPicPr>
-                    <pic:cNvPr id="163895200" name=""/>
+                    <pic:cNvPr id="743836696" name=""/>
                     <pic:cNvPicPr/>
                   </pic:nvPicPr>
                   <pic:blipFill>
@@ -11791,7 +11863,7 @@
                   <pic:spPr>
                     <a:xfrm>
                       <a:off x="0" y="0"/>
-                      <a:ext cx="5731510" cy="2366645"/>
+                      <a:ext cx="5731510" cy="2235200"/>
                     </a:xfrm>
                     <a:prstGeom prst="rect">
                       <a:avLst/>
@@ -11866,17 +11938,1236 @@
           <w:sz w:val="16"/>
           <w:szCs w:val="16"/>
         </w:rPr>
-        <w:t>weighting of study and shading behind indicates (IDK WHAT).</w:t>
+        <w:t xml:space="preserve">weighting of study and shading behind indicates </w:t>
+      </w:r>
+      <w:r>
+        <w:rPr>
+          <w:rFonts w:ascii="Arial" w:hAnsi="Arial" w:cs="Arial"/>
+          <w:sz w:val="16"/>
+          <w:szCs w:val="16"/>
+        </w:rPr>
+        <w:t>predicted values according to moderators</w:t>
+      </w:r>
+      <w:r>
+        <w:rPr>
+          <w:rFonts w:ascii="Arial" w:hAnsi="Arial" w:cs="Arial"/>
+          <w:sz w:val="16"/>
+          <w:szCs w:val="16"/>
+        </w:rPr>
+        <w:t>.</w:t>
       </w:r>
     </w:p>
     <w:p>
       <w:pPr>
-        <w:spacing w:line="240" w:lineRule="auto"/>
+        <w:spacing w:line="360" w:lineRule="auto"/>
         <w:jc w:val="both"/>
         <w:rPr>
           <w:rFonts w:ascii="Arial" w:hAnsi="Arial" w:cs="Arial"/>
-          <w:sz w:val="16"/>
-          <w:szCs w:val="16"/>
+          <w:sz w:val="22"/>
+          <w:szCs w:val="22"/>
+        </w:rPr>
+      </w:pPr>
+      <w:r>
+        <w:rPr>
+          <w:rFonts w:ascii="Arial" w:hAnsi="Arial" w:cs="Arial"/>
+          <w:sz w:val="22"/>
+          <w:szCs w:val="22"/>
+        </w:rPr>
+        <w:t>(719 words)</w:t>
+      </w:r>
+    </w:p>
+    <w:p>
+      <w:pPr>
+        <w:pStyle w:val="Heading2"/>
+        <w:spacing w:line="360" w:lineRule="auto"/>
+        <w:jc w:val="both"/>
+        <w:rPr>
+          <w:rFonts w:ascii="Arial" w:hAnsi="Arial" w:cs="Arial"/>
+        </w:rPr>
+      </w:pPr>
+      <w:bookmarkStart w:id="7" w:name="_Toc226399182"/>
+      <w:r>
+        <w:rPr>
+          <w:rFonts w:ascii="Arial" w:hAnsi="Arial" w:cs="Arial"/>
+        </w:rPr>
+        <w:t>Discussion</w:t>
+      </w:r>
+      <w:bookmarkEnd w:id="7"/>
+    </w:p>
+    <w:p>
+      <w:pPr>
+        <w:spacing w:line="360" w:lineRule="auto"/>
+        <w:jc w:val="both"/>
+        <w:rPr>
+          <w:rFonts w:ascii="Arial" w:hAnsi="Arial" w:cs="Arial"/>
+          <w:sz w:val="22"/>
+          <w:szCs w:val="22"/>
+        </w:rPr>
+      </w:pPr>
+      <w:r>
+        <w:rPr>
+          <w:rFonts w:ascii="Arial" w:hAnsi="Arial" w:cs="Arial"/>
+          <w:sz w:val="22"/>
+          <w:szCs w:val="22"/>
+        </w:rPr>
+        <w:t xml:space="preserve">While this systematic review did not find a significant trend in relative CC </w:t>
+      </w:r>
+      <w:r>
+        <w:rPr>
+          <w:rFonts w:ascii="Arial" w:hAnsi="Arial" w:cs="Arial"/>
+          <w:sz w:val="22"/>
+          <w:szCs w:val="22"/>
+        </w:rPr>
+        <w:t>between urban and rural populations, the overall effect size as well as the majority of those extracted</w:t>
+      </w:r>
+      <w:r>
+        <w:rPr>
+          <w:rFonts w:ascii="Arial" w:hAnsi="Arial" w:cs="Arial"/>
+          <w:sz w:val="22"/>
+          <w:szCs w:val="22"/>
+        </w:rPr>
+        <w:t xml:space="preserve"> (13/18)</w:t>
+      </w:r>
+      <w:r>
+        <w:rPr>
+          <w:rFonts w:ascii="Arial" w:hAnsi="Arial" w:cs="Arial"/>
+          <w:sz w:val="22"/>
+          <w:szCs w:val="22"/>
+        </w:rPr>
+        <w:t xml:space="preserve"> were negative</w:t>
+      </w:r>
+      <w:r>
+        <w:rPr>
+          <w:rFonts w:ascii="Arial" w:hAnsi="Arial" w:cs="Arial"/>
+          <w:sz w:val="22"/>
+          <w:szCs w:val="22"/>
+        </w:rPr>
+        <w:t xml:space="preserve"> which offers some support to the domestication syndrome hypothesis</w:t>
+      </w:r>
+      <w:r>
+        <w:rPr>
+          <w:rFonts w:ascii="Arial" w:hAnsi="Arial" w:cs="Arial"/>
+          <w:sz w:val="22"/>
+          <w:szCs w:val="22"/>
+        </w:rPr>
+        <w:t xml:space="preserve">. </w:t>
+      </w:r>
+      <w:r>
+        <w:rPr>
+          <w:rFonts w:ascii="Arial" w:hAnsi="Arial" w:cs="Arial"/>
+          <w:sz w:val="22"/>
+          <w:szCs w:val="22"/>
+        </w:rPr>
+        <w:t xml:space="preserve">The sample size for each designation </w:t>
+      </w:r>
+      <w:r>
+        <w:rPr>
+          <w:rFonts w:ascii="Arial" w:hAnsi="Arial" w:cs="Arial"/>
+          <w:sz w:val="22"/>
+          <w:szCs w:val="22"/>
+        </w:rPr>
+        <w:t>did not exceed 25 specimens for any species or ecoregion</w:t>
+      </w:r>
+      <w:r>
+        <w:rPr>
+          <w:rFonts w:ascii="Arial" w:hAnsi="Arial" w:cs="Arial"/>
+          <w:sz w:val="22"/>
+          <w:szCs w:val="22"/>
+        </w:rPr>
+        <w:t>, and for one was as low as 2; had this been greater, I likely would have found smaller confidence intervals which would have lent power to the estimations</w:t>
+      </w:r>
+      <w:r>
+        <w:rPr>
+          <w:rFonts w:ascii="Arial" w:hAnsi="Arial" w:cs="Arial"/>
+          <w:sz w:val="22"/>
+          <w:szCs w:val="22"/>
+        </w:rPr>
+        <w:t xml:space="preserve">. Ultimately, it is arguable </w:t>
+      </w:r>
+      <w:r>
+        <w:rPr>
+          <w:rFonts w:ascii="Arial" w:hAnsi="Arial" w:cs="Arial"/>
+          <w:sz w:val="22"/>
+          <w:szCs w:val="22"/>
+        </w:rPr>
+        <w:t xml:space="preserve">that there was an insufficient research pool to draw from for a meta-analysis, and that the question I chose to address </w:t>
+      </w:r>
+      <w:r>
+        <w:rPr>
+          <w:rFonts w:ascii="Arial" w:hAnsi="Arial" w:cs="Arial"/>
+          <w:sz w:val="22"/>
+          <w:szCs w:val="22"/>
+        </w:rPr>
+        <w:t xml:space="preserve">is not ready for such analysis. With only 3 papers, multicollinearity became a considerable obstacle to analyses </w:t>
+      </w:r>
+      <w:r>
+        <w:rPr>
+          <w:rFonts w:ascii="Arial" w:hAnsi="Arial" w:cs="Arial"/>
+          <w:sz w:val="22"/>
+          <w:szCs w:val="22"/>
+        </w:rPr>
+        <w:t xml:space="preserve">(as all effect sizes with, for example, Snell-Rood as paper necessarily also had Plains as ecoregion, and body length as the </w:t>
+      </w:r>
+      <w:r>
+        <w:rPr>
+          <w:rFonts w:ascii="Arial" w:hAnsi="Arial" w:cs="Arial"/>
+          <w:sz w:val="22"/>
+          <w:szCs w:val="22"/>
+        </w:rPr>
+        <w:t xml:space="preserve">metric for calculating relative CC). This was mitigated by applying a PCA and dropping species from the model, but </w:t>
+      </w:r>
+      <w:r>
+        <w:rPr>
+          <w:rFonts w:ascii="Arial" w:hAnsi="Arial" w:cs="Arial"/>
+          <w:sz w:val="22"/>
+          <w:szCs w:val="22"/>
+        </w:rPr>
+        <w:t xml:space="preserve">it would have been preferable to simply have more papers where effects of each moderator could be disentangled by repetition. </w:t>
+      </w:r>
+    </w:p>
+    <w:p>
+      <w:pPr>
+        <w:spacing w:line="360" w:lineRule="auto"/>
+        <w:jc w:val="both"/>
+        <w:rPr>
+          <w:rFonts w:ascii="Arial" w:hAnsi="Arial" w:cs="Arial"/>
+          <w:sz w:val="22"/>
+          <w:szCs w:val="22"/>
+        </w:rPr>
+      </w:pPr>
+      <w:r>
+        <w:rPr>
+          <w:rFonts w:ascii="Arial" w:hAnsi="Arial" w:cs="Arial"/>
+          <w:sz w:val="22"/>
+          <w:szCs w:val="22"/>
+        </w:rPr>
+        <w:t xml:space="preserve">One mode by which this analysis may have been improved is by </w:t>
+      </w:r>
+      <w:proofErr w:type="spellStart"/>
+      <w:r>
+        <w:rPr>
+          <w:rFonts w:ascii="Arial" w:hAnsi="Arial" w:cs="Arial"/>
+          <w:sz w:val="22"/>
+          <w:szCs w:val="22"/>
+        </w:rPr>
+        <w:t>subsetting</w:t>
+      </w:r>
+      <w:proofErr w:type="spellEnd"/>
+      <w:r>
+        <w:rPr>
+          <w:rFonts w:ascii="Arial" w:hAnsi="Arial" w:cs="Arial"/>
+          <w:sz w:val="22"/>
+          <w:szCs w:val="22"/>
+        </w:rPr>
+        <w:t xml:space="preserve"> specimens by collection year (for example grouping those from 1885-1915 together). This would have allowed inference on the presence of any change in effect size through time</w:t>
+      </w:r>
+      <w:r>
+        <w:rPr>
+          <w:rFonts w:ascii="Arial" w:hAnsi="Arial" w:cs="Arial"/>
+          <w:sz w:val="22"/>
+          <w:szCs w:val="22"/>
+        </w:rPr>
+        <w:t xml:space="preserve">, where we would expect the trend to get stronger as selection had time to act and as urbanisation intensified. However, this would have led to insufficient sample size </w:t>
+      </w:r>
+      <w:r>
+        <w:rPr>
+          <w:rFonts w:ascii="Arial" w:hAnsi="Arial" w:cs="Arial"/>
+          <w:sz w:val="22"/>
+          <w:szCs w:val="22"/>
+        </w:rPr>
+        <w:t xml:space="preserve">for mean calculations and therefore required either some time periods to be </w:t>
+      </w:r>
+      <w:r>
+        <w:rPr>
+          <w:rFonts w:ascii="Arial" w:hAnsi="Arial" w:cs="Arial"/>
+          <w:sz w:val="22"/>
+          <w:szCs w:val="22"/>
+        </w:rPr>
+        <w:t xml:space="preserve">dropped, or for ecoregions to be ignored. </w:t>
+      </w:r>
+      <w:r>
+        <w:rPr>
+          <w:rFonts w:ascii="Arial" w:hAnsi="Arial" w:cs="Arial"/>
+          <w:sz w:val="22"/>
+          <w:szCs w:val="22"/>
+        </w:rPr>
+        <w:t xml:space="preserve">A better solution would be to repeat the meta-analysis after sufficient time had passed for more relevant publications to become available. </w:t>
+      </w:r>
+    </w:p>
+    <w:p>
+      <w:pPr>
+        <w:spacing w:line="360" w:lineRule="auto"/>
+        <w:jc w:val="both"/>
+        <w:rPr>
+          <w:rFonts w:ascii="Arial" w:hAnsi="Arial" w:cs="Arial"/>
+          <w:sz w:val="22"/>
+          <w:szCs w:val="22"/>
+        </w:rPr>
+      </w:pPr>
+      <w:r>
+        <w:rPr>
+          <w:rFonts w:ascii="Arial" w:hAnsi="Arial" w:cs="Arial"/>
+          <w:sz w:val="22"/>
+          <w:szCs w:val="22"/>
+        </w:rPr>
+        <w:lastRenderedPageBreak/>
+        <w:t xml:space="preserve">In the interest of transparency, a </w:t>
+      </w:r>
+      <w:proofErr w:type="spellStart"/>
+      <w:r>
+        <w:rPr>
+          <w:rFonts w:ascii="Arial" w:hAnsi="Arial" w:cs="Arial"/>
+          <w:sz w:val="22"/>
+          <w:szCs w:val="22"/>
+        </w:rPr>
+        <w:t>github</w:t>
+      </w:r>
+      <w:proofErr w:type="spellEnd"/>
+      <w:r>
+        <w:rPr>
+          <w:rFonts w:ascii="Arial" w:hAnsi="Arial" w:cs="Arial"/>
+          <w:sz w:val="22"/>
+          <w:szCs w:val="22"/>
+        </w:rPr>
+        <w:t xml:space="preserve"> of the cleaned data and code is available (methods). </w:t>
+      </w:r>
+      <w:r>
+        <w:rPr>
+          <w:rFonts w:ascii="Arial" w:hAnsi="Arial" w:cs="Arial"/>
+          <w:sz w:val="22"/>
+          <w:szCs w:val="22"/>
+        </w:rPr>
+        <w:t xml:space="preserve">This inclusion was a direct response to encountering a frustrating lack of transparency in </w:t>
+      </w:r>
+      <w:r>
+        <w:rPr>
+          <w:rFonts w:ascii="Arial" w:hAnsi="Arial" w:cs="Arial"/>
+          <w:sz w:val="22"/>
+          <w:szCs w:val="22"/>
+        </w:rPr>
+        <w:t xml:space="preserve">my literature search. Papers largely failed to report how they designated collection sites as urban or rural, forcing </w:t>
+      </w:r>
+      <w:r>
+        <w:rPr>
+          <w:rFonts w:ascii="Arial" w:hAnsi="Arial" w:cs="Arial"/>
+          <w:sz w:val="22"/>
+          <w:szCs w:val="22"/>
+        </w:rPr>
+        <w:t xml:space="preserve">this analysis to make assumptions and arbitrary designations (though the impact of this on the model may be mitigated by fitting paper as a random effect). </w:t>
+      </w:r>
+      <w:r>
+        <w:rPr>
+          <w:rFonts w:ascii="Arial" w:hAnsi="Arial" w:cs="Arial"/>
+          <w:sz w:val="22"/>
+          <w:szCs w:val="22"/>
+        </w:rPr>
+        <w:t xml:space="preserve">Additionally, Parsons et al (2020) took relevant measurements, which were rendered inaccessible by inadequate reporting. </w:t>
+      </w:r>
+      <w:r>
+        <w:rPr>
+          <w:rFonts w:ascii="Arial" w:hAnsi="Arial" w:cs="Arial"/>
+          <w:sz w:val="22"/>
+          <w:szCs w:val="22"/>
+        </w:rPr>
+        <w:t xml:space="preserve">This highlights a systemic issue in scientific reporting, where </w:t>
+      </w:r>
+      <w:r>
+        <w:rPr>
+          <w:rFonts w:ascii="Arial" w:hAnsi="Arial" w:cs="Arial"/>
+          <w:sz w:val="22"/>
+          <w:szCs w:val="22"/>
+        </w:rPr>
+        <w:t xml:space="preserve">authors limit progress </w:t>
+      </w:r>
+      <w:r>
+        <w:rPr>
+          <w:rFonts w:ascii="Arial" w:hAnsi="Arial" w:cs="Arial"/>
+          <w:sz w:val="22"/>
+          <w:szCs w:val="22"/>
+        </w:rPr>
+        <w:t>by</w:t>
+      </w:r>
+      <w:r>
+        <w:rPr>
+          <w:rFonts w:ascii="Arial" w:hAnsi="Arial" w:cs="Arial"/>
+          <w:sz w:val="22"/>
+          <w:szCs w:val="22"/>
+        </w:rPr>
+        <w:t xml:space="preserve"> neglecting to share their data</w:t>
+      </w:r>
+      <w:r>
+        <w:rPr>
+          <w:rFonts w:ascii="Arial" w:hAnsi="Arial" w:cs="Arial"/>
+          <w:sz w:val="22"/>
+          <w:szCs w:val="22"/>
+        </w:rPr>
+        <w:t xml:space="preserve"> </w:t>
+      </w:r>
+      <w:r>
+        <w:rPr>
+          <w:rFonts w:ascii="Arial" w:hAnsi="Arial" w:cs="Arial"/>
+          <w:sz w:val="22"/>
+          <w:szCs w:val="22"/>
+        </w:rPr>
+        <w:fldChar w:fldCharType="begin"/>
+      </w:r>
+      <w:r>
+        <w:rPr>
+          <w:rFonts w:ascii="Arial" w:hAnsi="Arial" w:cs="Arial"/>
+          <w:sz w:val="22"/>
+          <w:szCs w:val="22"/>
+        </w:rPr>
+        <w:instrText xml:space="preserve"> ADDIN ZOTERO_ITEM CSL_CITATION {"citationID":"rBfbo0xy","properties":{"formattedCitation":"(Farley {\\i{}et al.}, 2018)","plainCitation":"(Farley et al., 2018)","noteIndex":0},"citationItems":[{"id":363,"uris":["http://zotero.org/users/local/lVrMvdUB/items/P73SCBWT"],"itemData":{"id":363,"type":"article-journal","abstract":"Ecology has joined a world of big data. Two complementary frameworks define big data: data that exceed the analytical capacities of individuals or disciplines or the “Four Vs” axes of volume, variety, veracity, and velocity. Variety predominates in ecoinformatics and limits the scalability of ecological science. Volume varies widely. Ecological velocity is low but growing as data throughput and societal needs increase. Ecological big-data systems include in situ and remote sensors, community data resources, biodiversity databases, citizen science, and permanent stations. Technological solutions include the development of open code- and data-sharing platforms, flexible statistical models that can handle heterogeneous data and sources of uncertainty, and cloud-computing delivery of high-velocity computing to large-volume analytics. Cultural solutions include training targeted to early and current scientific workforce and strengthening collaborations among ecologists and data scientists. The broader goal is to maximize the power, scalability, and timeliness of ecological insights and forecasting.","container-title":"BioScience","DOI":"10.1093/biosci/biy068","ISSN":"0006-3568","issue":"8","journalAbbreviation":"BioScience","page":"563-576","source":"Silverchair","title":"Situating Ecology as a Big-Data Science: Current Advances, Challenges, and Solutions","title-short":"Situating Ecology as a Big-Data Science","volume":"68","author":[{"family":"Farley","given":"Scott S"},{"family":"Dawson","given":"Andria"},{"family":"Goring","given":"Simon J"},{"family":"Williams","given":"John W"}],"issued":{"date-parts":[["2018",8,1]]}}}],"schema":"https://github.com/citation-style-language/schema/raw/master/csl-citation.json"} </w:instrText>
+      </w:r>
+      <w:r>
+        <w:rPr>
+          <w:rFonts w:ascii="Arial" w:hAnsi="Arial" w:cs="Arial"/>
+          <w:sz w:val="22"/>
+          <w:szCs w:val="22"/>
+        </w:rPr>
+        <w:fldChar w:fldCharType="separate"/>
+      </w:r>
+      <w:r>
+        <w:rPr>
+          <w:rFonts w:ascii="Arial" w:hAnsi="Arial" w:cs="Arial"/>
+          <w:kern w:val="0"/>
+          <w:sz w:val="22"/>
+        </w:rPr>
+        <w:t xml:space="preserve">(Farley </w:t>
+      </w:r>
+      <w:r>
+        <w:rPr>
+          <w:rFonts w:ascii="Arial" w:hAnsi="Arial" w:cs="Arial"/>
+          <w:i/>
+          <w:iCs/>
+          <w:kern w:val="0"/>
+          <w:sz w:val="22"/>
+        </w:rPr>
+        <w:t>et al.</w:t>
+      </w:r>
+      <w:r>
+        <w:rPr>
+          <w:rFonts w:ascii="Arial" w:hAnsi="Arial" w:cs="Arial"/>
+          <w:kern w:val="0"/>
+          <w:sz w:val="22"/>
+        </w:rPr>
+        <w:t>, 2018)</w:t>
+      </w:r>
+      <w:r>
+        <w:rPr>
+          <w:rFonts w:ascii="Arial" w:hAnsi="Arial" w:cs="Arial"/>
+          <w:sz w:val="22"/>
+          <w:szCs w:val="22"/>
+        </w:rPr>
+        <w:fldChar w:fldCharType="end"/>
+      </w:r>
+      <w:r>
+        <w:rPr>
+          <w:rFonts w:ascii="Arial" w:hAnsi="Arial" w:cs="Arial"/>
+          <w:sz w:val="22"/>
+          <w:szCs w:val="22"/>
+        </w:rPr>
+        <w:t xml:space="preserve">. </w:t>
+      </w:r>
+    </w:p>
+    <w:p>
+      <w:pPr>
+        <w:spacing w:line="360" w:lineRule="auto"/>
+        <w:jc w:val="both"/>
+        <w:rPr>
+          <w:rFonts w:ascii="Arial" w:hAnsi="Arial" w:cs="Arial"/>
+          <w:sz w:val="22"/>
+          <w:szCs w:val="22"/>
+        </w:rPr>
+      </w:pPr>
+      <w:r>
+        <w:rPr>
+          <w:rFonts w:ascii="Arial" w:hAnsi="Arial" w:cs="Arial"/>
+          <w:sz w:val="22"/>
+          <w:szCs w:val="22"/>
+        </w:rPr>
+        <w:t xml:space="preserve">The ecology of the 11 species examined in this study show considerable variation, </w:t>
+      </w:r>
+      <w:r>
+        <w:rPr>
+          <w:rFonts w:ascii="Arial" w:hAnsi="Arial" w:cs="Arial"/>
+          <w:sz w:val="22"/>
+          <w:szCs w:val="22"/>
+        </w:rPr>
+        <w:t>including</w:t>
+      </w:r>
+      <w:r>
+        <w:rPr>
+          <w:rFonts w:ascii="Arial" w:hAnsi="Arial" w:cs="Arial"/>
+          <w:sz w:val="22"/>
+          <w:szCs w:val="22"/>
+        </w:rPr>
+        <w:t xml:space="preserve"> </w:t>
+      </w:r>
+      <w:proofErr w:type="spellStart"/>
+      <w:r>
+        <w:rPr>
+          <w:rFonts w:ascii="Arial" w:hAnsi="Arial" w:cs="Arial"/>
+          <w:sz w:val="22"/>
+          <w:szCs w:val="22"/>
+        </w:rPr>
+        <w:t>Eulipotyphla</w:t>
+      </w:r>
+      <w:proofErr w:type="spellEnd"/>
+      <w:r>
+        <w:rPr>
+          <w:rFonts w:ascii="Arial" w:hAnsi="Arial" w:cs="Arial"/>
+          <w:sz w:val="22"/>
+          <w:szCs w:val="22"/>
+        </w:rPr>
+        <w:t xml:space="preserve"> </w:t>
+      </w:r>
+      <w:r>
+        <w:rPr>
+          <w:rFonts w:ascii="Arial" w:hAnsi="Arial" w:cs="Arial"/>
+          <w:sz w:val="22"/>
+          <w:szCs w:val="22"/>
+        </w:rPr>
+        <w:t xml:space="preserve">(shrews, n=2), </w:t>
+      </w:r>
+      <w:r>
+        <w:rPr>
+          <w:rFonts w:ascii="Arial" w:hAnsi="Arial" w:cs="Arial"/>
+          <w:sz w:val="22"/>
+          <w:szCs w:val="22"/>
+        </w:rPr>
+        <w:t>R</w:t>
+      </w:r>
+      <w:r>
+        <w:rPr>
+          <w:rFonts w:ascii="Arial" w:hAnsi="Arial" w:cs="Arial"/>
+          <w:sz w:val="22"/>
+          <w:szCs w:val="22"/>
+        </w:rPr>
+        <w:t>odentia (n=</w:t>
+      </w:r>
+      <w:r>
+        <w:rPr>
+          <w:rFonts w:ascii="Arial" w:hAnsi="Arial" w:cs="Arial"/>
+          <w:sz w:val="22"/>
+          <w:szCs w:val="22"/>
+        </w:rPr>
+        <w:t>6</w:t>
+      </w:r>
+      <w:r>
+        <w:rPr>
+          <w:rFonts w:ascii="Arial" w:hAnsi="Arial" w:cs="Arial"/>
+          <w:sz w:val="22"/>
+          <w:szCs w:val="22"/>
+        </w:rPr>
+        <w:t>)</w:t>
+      </w:r>
+      <w:r>
+        <w:rPr>
+          <w:rFonts w:ascii="Arial" w:hAnsi="Arial" w:cs="Arial"/>
+          <w:sz w:val="22"/>
+          <w:szCs w:val="22"/>
+        </w:rPr>
+        <w:t xml:space="preserve">, </w:t>
+      </w:r>
+      <w:proofErr w:type="spellStart"/>
+      <w:r>
+        <w:rPr>
+          <w:rFonts w:ascii="Arial" w:hAnsi="Arial" w:cs="Arial"/>
+          <w:sz w:val="22"/>
+          <w:szCs w:val="22"/>
+        </w:rPr>
+        <w:t>Chiroptera</w:t>
+      </w:r>
+      <w:proofErr w:type="spellEnd"/>
+      <w:r>
+        <w:rPr>
+          <w:rFonts w:ascii="Arial" w:hAnsi="Arial" w:cs="Arial"/>
+          <w:sz w:val="22"/>
+          <w:szCs w:val="22"/>
+        </w:rPr>
+        <w:t xml:space="preserve"> (</w:t>
+      </w:r>
+      <w:r>
+        <w:rPr>
+          <w:rFonts w:ascii="Arial" w:hAnsi="Arial" w:cs="Arial"/>
+          <w:sz w:val="22"/>
+          <w:szCs w:val="22"/>
+        </w:rPr>
+        <w:t xml:space="preserve">bats, </w:t>
+      </w:r>
+      <w:r>
+        <w:rPr>
+          <w:rFonts w:ascii="Arial" w:hAnsi="Arial" w:cs="Arial"/>
+          <w:sz w:val="22"/>
+          <w:szCs w:val="22"/>
+        </w:rPr>
+        <w:t>n=2)</w:t>
+      </w:r>
+      <w:r>
+        <w:rPr>
+          <w:rFonts w:ascii="Arial" w:hAnsi="Arial" w:cs="Arial"/>
+          <w:sz w:val="22"/>
+          <w:szCs w:val="22"/>
+        </w:rPr>
+        <w:t xml:space="preserve"> and </w:t>
+      </w:r>
+      <w:r>
+        <w:rPr>
+          <w:rFonts w:ascii="Arial" w:hAnsi="Arial" w:cs="Arial"/>
+          <w:sz w:val="22"/>
+          <w:szCs w:val="22"/>
+        </w:rPr>
+        <w:t>C</w:t>
+      </w:r>
+      <w:r>
+        <w:rPr>
+          <w:rFonts w:ascii="Arial" w:hAnsi="Arial" w:cs="Arial"/>
+          <w:sz w:val="22"/>
+          <w:szCs w:val="22"/>
+        </w:rPr>
+        <w:t xml:space="preserve">arnivora (n=1). </w:t>
+      </w:r>
+      <w:r>
+        <w:rPr>
+          <w:rFonts w:ascii="Arial" w:hAnsi="Arial" w:cs="Arial"/>
+          <w:sz w:val="22"/>
+          <w:szCs w:val="22"/>
+        </w:rPr>
+        <w:t xml:space="preserve">Interestingly, </w:t>
+      </w:r>
+      <w:r>
+        <w:rPr>
+          <w:rFonts w:ascii="Arial" w:hAnsi="Arial" w:cs="Arial"/>
+          <w:sz w:val="22"/>
+          <w:szCs w:val="22"/>
+        </w:rPr>
+        <w:t>the big brown bat (</w:t>
+      </w:r>
+      <w:r>
+        <w:rPr>
+          <w:rFonts w:ascii="Arial" w:hAnsi="Arial" w:cs="Arial"/>
+          <w:i/>
+          <w:iCs/>
+          <w:sz w:val="22"/>
+          <w:szCs w:val="22"/>
+        </w:rPr>
+        <w:t>Eptesicus fuscus</w:t>
+      </w:r>
+      <w:r>
+        <w:rPr>
+          <w:rFonts w:ascii="Arial" w:hAnsi="Arial" w:cs="Arial"/>
+          <w:sz w:val="22"/>
+          <w:szCs w:val="22"/>
+        </w:rPr>
+        <w:t xml:space="preserve">) </w:t>
+      </w:r>
+      <w:r>
+        <w:rPr>
+          <w:rFonts w:ascii="Arial" w:hAnsi="Arial" w:cs="Arial"/>
+          <w:sz w:val="22"/>
+          <w:szCs w:val="22"/>
+        </w:rPr>
+        <w:t xml:space="preserve">and </w:t>
+      </w:r>
+      <w:r>
+        <w:rPr>
+          <w:rFonts w:ascii="Arial" w:hAnsi="Arial" w:cs="Arial"/>
+          <w:sz w:val="22"/>
+          <w:szCs w:val="22"/>
+        </w:rPr>
+        <w:t xml:space="preserve">American red squirrel </w:t>
+      </w:r>
+      <w:r>
+        <w:rPr>
+          <w:rFonts w:ascii="Arial" w:hAnsi="Arial" w:cs="Arial"/>
+          <w:sz w:val="22"/>
+          <w:szCs w:val="22"/>
+        </w:rPr>
+        <w:t>(</w:t>
+      </w:r>
+      <w:proofErr w:type="spellStart"/>
+      <w:r>
+        <w:rPr>
+          <w:rFonts w:ascii="Arial" w:hAnsi="Arial" w:cs="Arial"/>
+          <w:i/>
+          <w:iCs/>
+          <w:sz w:val="22"/>
+          <w:szCs w:val="22"/>
+        </w:rPr>
+        <w:t>Tamiasciurus</w:t>
+      </w:r>
+      <w:proofErr w:type="spellEnd"/>
+      <w:r>
+        <w:rPr>
+          <w:rFonts w:ascii="Arial" w:hAnsi="Arial" w:cs="Arial"/>
+          <w:i/>
+          <w:iCs/>
+          <w:sz w:val="22"/>
+          <w:szCs w:val="22"/>
+        </w:rPr>
+        <w:t xml:space="preserve"> </w:t>
+      </w:r>
+      <w:proofErr w:type="spellStart"/>
+      <w:r>
+        <w:rPr>
+          <w:rFonts w:ascii="Arial" w:hAnsi="Arial" w:cs="Arial"/>
+          <w:i/>
+          <w:iCs/>
+          <w:sz w:val="22"/>
+          <w:szCs w:val="22"/>
+        </w:rPr>
+        <w:t>hudsonicus</w:t>
+      </w:r>
+      <w:proofErr w:type="spellEnd"/>
+      <w:r>
+        <w:rPr>
+          <w:rFonts w:ascii="Arial" w:hAnsi="Arial" w:cs="Arial"/>
+          <w:sz w:val="22"/>
+          <w:szCs w:val="22"/>
+        </w:rPr>
+        <w:t>)</w:t>
+      </w:r>
+      <w:r>
+        <w:rPr>
+          <w:rFonts w:ascii="Arial" w:hAnsi="Arial" w:cs="Arial"/>
+          <w:sz w:val="22"/>
+          <w:szCs w:val="22"/>
+        </w:rPr>
+        <w:t xml:space="preserve"> </w:t>
+      </w:r>
+      <w:r>
+        <w:rPr>
+          <w:rFonts w:ascii="Arial" w:hAnsi="Arial" w:cs="Arial"/>
+          <w:sz w:val="22"/>
+          <w:szCs w:val="22"/>
+        </w:rPr>
+        <w:t xml:space="preserve">showed </w:t>
+      </w:r>
+      <w:r>
+        <w:rPr>
+          <w:rFonts w:ascii="Arial" w:hAnsi="Arial" w:cs="Arial"/>
+          <w:sz w:val="22"/>
+          <w:szCs w:val="22"/>
+        </w:rPr>
+        <w:t xml:space="preserve">higher relative CC in urban areas, while the </w:t>
+      </w:r>
+      <w:r>
+        <w:rPr>
+          <w:rFonts w:ascii="Arial" w:hAnsi="Arial" w:cs="Arial"/>
+          <w:sz w:val="22"/>
+          <w:szCs w:val="22"/>
+        </w:rPr>
+        <w:t>little brown bat (</w:t>
+      </w:r>
+      <w:r>
+        <w:rPr>
+          <w:rFonts w:ascii="Arial" w:hAnsi="Arial" w:cs="Arial"/>
+          <w:i/>
+          <w:iCs/>
+          <w:sz w:val="22"/>
+          <w:szCs w:val="22"/>
+        </w:rPr>
+        <w:t xml:space="preserve">Myotis </w:t>
+      </w:r>
+      <w:proofErr w:type="spellStart"/>
+      <w:r>
+        <w:rPr>
+          <w:rFonts w:ascii="Arial" w:hAnsi="Arial" w:cs="Arial"/>
+          <w:i/>
+          <w:iCs/>
+          <w:sz w:val="22"/>
+          <w:szCs w:val="22"/>
+        </w:rPr>
+        <w:t>lucifugus</w:t>
+      </w:r>
+      <w:proofErr w:type="spellEnd"/>
+      <w:r>
+        <w:rPr>
+          <w:rFonts w:ascii="Arial" w:hAnsi="Arial" w:cs="Arial"/>
+          <w:sz w:val="22"/>
+          <w:szCs w:val="22"/>
+        </w:rPr>
+        <w:t>)</w:t>
+      </w:r>
+      <w:r>
+        <w:rPr>
+          <w:rFonts w:ascii="Arial" w:hAnsi="Arial" w:cs="Arial"/>
+          <w:sz w:val="22"/>
+          <w:szCs w:val="22"/>
+        </w:rPr>
+        <w:t xml:space="preserve"> </w:t>
+      </w:r>
+      <w:r>
+        <w:rPr>
+          <w:rFonts w:ascii="Arial" w:hAnsi="Arial" w:cs="Arial"/>
+          <w:sz w:val="22"/>
+          <w:szCs w:val="22"/>
+        </w:rPr>
+        <w:t xml:space="preserve">and </w:t>
+      </w:r>
+      <w:r>
+        <w:rPr>
+          <w:rFonts w:ascii="Arial" w:hAnsi="Arial" w:cs="Arial"/>
+          <w:sz w:val="22"/>
+          <w:szCs w:val="22"/>
+        </w:rPr>
+        <w:t>E</w:t>
+      </w:r>
+      <w:r>
+        <w:rPr>
+          <w:rFonts w:ascii="Arial" w:hAnsi="Arial" w:cs="Arial"/>
+          <w:sz w:val="22"/>
+          <w:szCs w:val="22"/>
+        </w:rPr>
+        <w:t xml:space="preserve">astern grey squirrel </w:t>
+      </w:r>
+      <w:r>
+        <w:rPr>
+          <w:rFonts w:ascii="Arial" w:hAnsi="Arial" w:cs="Arial"/>
+          <w:sz w:val="22"/>
+          <w:szCs w:val="22"/>
+        </w:rPr>
+        <w:t>(</w:t>
+      </w:r>
+      <w:r>
+        <w:rPr>
+          <w:rFonts w:ascii="Arial" w:hAnsi="Arial" w:cs="Arial"/>
+          <w:i/>
+          <w:iCs/>
+          <w:sz w:val="22"/>
+          <w:szCs w:val="22"/>
+        </w:rPr>
+        <w:t>Sciurus carolinensis</w:t>
+      </w:r>
+      <w:r>
+        <w:rPr>
+          <w:rFonts w:ascii="Arial" w:hAnsi="Arial" w:cs="Arial"/>
+          <w:sz w:val="22"/>
+          <w:szCs w:val="22"/>
+        </w:rPr>
+        <w:t xml:space="preserve">) </w:t>
+      </w:r>
+      <w:r>
+        <w:rPr>
+          <w:rFonts w:ascii="Arial" w:hAnsi="Arial" w:cs="Arial"/>
+          <w:sz w:val="22"/>
+          <w:szCs w:val="22"/>
+        </w:rPr>
+        <w:t xml:space="preserve">showed lower. </w:t>
+      </w:r>
+      <w:r>
+        <w:rPr>
+          <w:rFonts w:ascii="Arial" w:hAnsi="Arial" w:cs="Arial"/>
+          <w:sz w:val="22"/>
+          <w:szCs w:val="22"/>
+        </w:rPr>
+        <w:t>Additionally, the racoon showed decreased relative CC in all</w:t>
+      </w:r>
+      <w:r>
+        <w:rPr>
+          <w:rFonts w:ascii="Arial" w:hAnsi="Arial" w:cs="Arial"/>
+          <w:sz w:val="22"/>
+          <w:szCs w:val="22"/>
+        </w:rPr>
+        <w:t xml:space="preserve"> urban</w:t>
+      </w:r>
+      <w:r>
+        <w:rPr>
+          <w:rFonts w:ascii="Arial" w:hAnsi="Arial" w:cs="Arial"/>
+          <w:sz w:val="22"/>
+          <w:szCs w:val="22"/>
+        </w:rPr>
+        <w:t xml:space="preserve"> groups but those from the desert ecoregion. </w:t>
+      </w:r>
+      <w:r>
+        <w:rPr>
+          <w:rFonts w:ascii="Arial" w:hAnsi="Arial" w:cs="Arial"/>
+          <w:sz w:val="22"/>
+          <w:szCs w:val="22"/>
+        </w:rPr>
+        <w:t xml:space="preserve">This highlights the </w:t>
+      </w:r>
+      <w:r>
+        <w:rPr>
+          <w:rFonts w:ascii="Arial" w:hAnsi="Arial" w:cs="Arial"/>
+          <w:sz w:val="22"/>
+          <w:szCs w:val="22"/>
+        </w:rPr>
+        <w:t xml:space="preserve">danger of making broad statements on the influence of human activity, including urbanisation, across even closely related taxa. </w:t>
+      </w:r>
+      <w:r>
+        <w:rPr>
+          <w:rFonts w:ascii="Arial" w:hAnsi="Arial" w:cs="Arial"/>
+          <w:sz w:val="22"/>
+          <w:szCs w:val="22"/>
+        </w:rPr>
+        <w:t xml:space="preserve">Both the cognitive demand hypothesis and </w:t>
+      </w:r>
+      <w:r>
+        <w:rPr>
+          <w:rFonts w:ascii="Arial" w:hAnsi="Arial" w:cs="Arial"/>
+          <w:sz w:val="22"/>
+          <w:szCs w:val="22"/>
+        </w:rPr>
+        <w:t>domestication hypothesis are not coverall and should be made on a</w:t>
+      </w:r>
+      <w:r>
+        <w:rPr>
+          <w:rFonts w:ascii="Arial" w:hAnsi="Arial" w:cs="Arial"/>
+          <w:sz w:val="22"/>
+          <w:szCs w:val="22"/>
+        </w:rPr>
+        <w:t xml:space="preserve"> species. if not population, level. </w:t>
+      </w:r>
+      <w:r>
+        <w:rPr>
+          <w:rFonts w:ascii="Arial" w:hAnsi="Arial" w:cs="Arial"/>
+          <w:sz w:val="22"/>
+          <w:szCs w:val="22"/>
+        </w:rPr>
+        <w:t xml:space="preserve">Grey squirrels have been overwhelmingly successful in our cities and </w:t>
+      </w:r>
+      <w:r>
+        <w:rPr>
+          <w:rFonts w:ascii="Arial" w:hAnsi="Arial" w:cs="Arial"/>
+          <w:sz w:val="22"/>
+          <w:szCs w:val="22"/>
+        </w:rPr>
+        <w:t xml:space="preserve">are recognised as generalists who can make use of human resources. In contrast, American red squirrels have experienced success in urban </w:t>
+      </w:r>
+      <w:proofErr w:type="gramStart"/>
+      <w:r>
+        <w:rPr>
+          <w:rFonts w:ascii="Arial" w:hAnsi="Arial" w:cs="Arial"/>
+          <w:sz w:val="22"/>
+          <w:szCs w:val="22"/>
+        </w:rPr>
+        <w:t>landscapes</w:t>
+      </w:r>
+      <w:proofErr w:type="gramEnd"/>
+      <w:r>
+        <w:rPr>
+          <w:rFonts w:ascii="Arial" w:hAnsi="Arial" w:cs="Arial"/>
+          <w:sz w:val="22"/>
+          <w:szCs w:val="22"/>
+        </w:rPr>
+        <w:t xml:space="preserve"> but largely only where native food sources are available. This may explain the variation in trend, where </w:t>
+      </w:r>
+      <w:r>
+        <w:rPr>
+          <w:rFonts w:ascii="Arial" w:hAnsi="Arial" w:cs="Arial"/>
+          <w:sz w:val="22"/>
+          <w:szCs w:val="22"/>
+        </w:rPr>
+        <w:t xml:space="preserve">the greys are under selection for tameness as this aids them in accessing resources, while reds are </w:t>
+      </w:r>
+      <w:r>
+        <w:rPr>
+          <w:rFonts w:ascii="Arial" w:hAnsi="Arial" w:cs="Arial"/>
+          <w:sz w:val="22"/>
+          <w:szCs w:val="22"/>
+        </w:rPr>
+        <w:t xml:space="preserve">not and may instead be under selection for cognitive capability to exploit cities while avoiding novel threats. </w:t>
+      </w:r>
+    </w:p>
+    <w:p>
+      <w:pPr>
+        <w:spacing w:line="360" w:lineRule="auto"/>
+        <w:jc w:val="both"/>
+        <w:rPr>
+          <w:rFonts w:ascii="Arial" w:hAnsi="Arial" w:cs="Arial"/>
+          <w:sz w:val="22"/>
+          <w:szCs w:val="22"/>
+        </w:rPr>
+      </w:pPr>
+      <w:r>
+        <w:rPr>
+          <w:rFonts w:ascii="Arial" w:hAnsi="Arial" w:cs="Arial"/>
+          <w:sz w:val="22"/>
+          <w:szCs w:val="22"/>
+        </w:rPr>
+        <w:t xml:space="preserve">Ultimately, while this project </w:t>
+      </w:r>
+      <w:r>
+        <w:rPr>
+          <w:rFonts w:ascii="Arial" w:hAnsi="Arial" w:cs="Arial"/>
+          <w:sz w:val="22"/>
+          <w:szCs w:val="22"/>
+        </w:rPr>
+        <w:t>was interesting to undertake, inferences that can be drawn from it are limited.</w:t>
+      </w:r>
+      <w:r>
+        <w:rPr>
+          <w:rFonts w:ascii="Arial" w:hAnsi="Arial" w:cs="Arial"/>
+          <w:sz w:val="22"/>
+          <w:szCs w:val="22"/>
+        </w:rPr>
+        <w:t xml:space="preserve"> Rural populations may also be under selection, especially considering that very few </w:t>
+      </w:r>
+      <w:r>
+        <w:rPr>
+          <w:rFonts w:ascii="Arial" w:hAnsi="Arial" w:cs="Arial"/>
+          <w:sz w:val="22"/>
+          <w:szCs w:val="22"/>
+        </w:rPr>
+        <w:t xml:space="preserve">truly </w:t>
+      </w:r>
+      <w:r>
+        <w:rPr>
+          <w:rFonts w:ascii="Arial" w:hAnsi="Arial" w:cs="Arial"/>
+          <w:sz w:val="22"/>
+          <w:szCs w:val="22"/>
+        </w:rPr>
+        <w:t xml:space="preserve">wild </w:t>
+      </w:r>
+      <w:r>
+        <w:rPr>
+          <w:rFonts w:ascii="Arial" w:hAnsi="Arial" w:cs="Arial"/>
+          <w:sz w:val="22"/>
+          <w:szCs w:val="22"/>
+        </w:rPr>
+        <w:t>environments remain</w:t>
+      </w:r>
+      <w:r>
+        <w:rPr>
+          <w:rFonts w:ascii="Arial" w:hAnsi="Arial" w:cs="Arial"/>
+          <w:sz w:val="22"/>
+          <w:szCs w:val="22"/>
+        </w:rPr>
+        <w:t xml:space="preserve"> and those that do are likely not being collected in</w:t>
+      </w:r>
+      <w:r>
+        <w:rPr>
+          <w:rFonts w:ascii="Arial" w:hAnsi="Arial" w:cs="Arial"/>
+          <w:sz w:val="22"/>
+          <w:szCs w:val="22"/>
+        </w:rPr>
+        <w:t>, which limits their usefulness as a control</w:t>
+      </w:r>
+      <w:r>
+        <w:rPr>
+          <w:rFonts w:ascii="Arial" w:hAnsi="Arial" w:cs="Arial"/>
+          <w:sz w:val="22"/>
+          <w:szCs w:val="22"/>
+        </w:rPr>
+        <w:t xml:space="preserve"> </w:t>
+      </w:r>
+      <w:r>
+        <w:rPr>
+          <w:rFonts w:ascii="Arial" w:hAnsi="Arial" w:cs="Arial"/>
+          <w:sz w:val="22"/>
+          <w:szCs w:val="22"/>
+        </w:rPr>
+        <w:fldChar w:fldCharType="begin"/>
+      </w:r>
+      <w:r>
+        <w:rPr>
+          <w:rFonts w:ascii="Arial" w:hAnsi="Arial" w:cs="Arial"/>
+          <w:sz w:val="22"/>
+          <w:szCs w:val="22"/>
+        </w:rPr>
+        <w:instrText xml:space="preserve"> ADDIN ZOTERO_ITEM CSL_CITATION {"citationID":"tOE8tIU7","properties":{"formattedCitation":"(Vitousek {\\i{}et al.}, 1997; Regacho and delBarco-Trillo, 2021)","plainCitation":"(Vitousek et al., 1997; Regacho and delBarco-Trillo, 2021)","noteIndex":0},"citationItems":[{"id":366,"uris":["http://zotero.org/users/local/lVrMvdUB/items/RNPJULID"],"itemData":{"id":366,"type":"article-journal","abstract":"Human alteration of Earth is substantial and growing. Between one-third and one-half of the land surface has been transformed by human action; the carbon dioxide concentration in the atmosphere has increased by nearly 30 percent since the beginning of the Industrial Revolution; more atmospheric nitrogen is fixed by humanity than by all natural terrestrial sources combined; more than half of all accessible surface fresh water is put to use by humanity; and about one-quarter of the bird species on Earth have been driven to extinction. By these and other standards, it is clear that we live on a human-dominated planet.","container-title":"Science","DOI":"10.1126/science.277.5325.494","issue":"5325","page":"494-499","publisher":"American Association for the Advancement of Science","source":"science.org (Atypon)","title":"Human Domination of Earth's Ecosystems","volume":"277","author":[{"family":"Vitousek","given":"Peter M."},{"family":"Mooney","given":"Harold A."},{"family":"Lubchenco","given":"Jane"},{"family":"Melillo","given":"Jerry M."}],"issued":{"date-parts":[["1997",7,25]]}}},{"id":323,"uris":["http://zotero.org/users/local/lVrMvdUB/items/DCM2QUAF"],"itemData":{"id":323,"type":"article","abstract":"The expansion of urban environments and how animals may be affected by them are being increasingly investigated, leading to a surge in urban ecology studies. Many urban ecology studies involve a direct comparison between rural and urban populations, or the use of urban gradients along a continuum from rural to urban areas. The implicit, although not properly investigated, assumption in these rural vs urban comparisons is that the rural populations offer a control that represents a lack of the anthropogenic stressors affecting the urban populations. Here we used museum skulls from 14 rodent species to conduct two separate studies, measuring fluctuating asymmetry (FA) as a proxy of developmental stress to assess the effect of anthropogenic disturbance. First, we compared urban and rural specimens of house mice (Mus musculus) to validate our methodological approach. Second, we compared rural specimens from 14 rodent species collected during the last two centuries across Austria. We hypothesised that FA in rural populations has not increased over the last two centuries, which would support the use of rural populations as a proper control in rural vs urban comparisons. We found higher morphological asymmetry in urban populations of Mus musculus compared to rural populations, which is consistent with similar studies in other species. However, we did not find any significant increase in FA over time in rural populations for any of the studied species. This supports the common practice of using rural populations as a control in rural vs urban comparisons when assessing the effects of urbanisation.","DOI":"10.21203/rs.3.rs-795506/v1","note":"ISSN: 2693-5015","publisher":"Research Square","source":"Research Square","title":"Morphological Stability of Rural Populations Confirms Their Use As Controls in Urban Ecology Studies","URL":"https://www.researchsquare.com/article/rs-795506/v1","author":[{"family":"Regacho","given":"Tania"},{"family":"Trillo","given":"Javier","non-dropping-particle":"delBarco-"}],"accessed":{"date-parts":[["2026",4,5]]},"issued":{"date-parts":[["2021",9,13]]}}}],"schema":"https://github.com/citation-style-language/schema/raw/master/csl-citation.json"} </w:instrText>
+      </w:r>
+      <w:r>
+        <w:rPr>
+          <w:rFonts w:ascii="Arial" w:hAnsi="Arial" w:cs="Arial"/>
+          <w:sz w:val="22"/>
+          <w:szCs w:val="22"/>
+        </w:rPr>
+        <w:fldChar w:fldCharType="separate"/>
+      </w:r>
+      <w:r>
+        <w:rPr>
+          <w:rFonts w:ascii="Arial" w:hAnsi="Arial" w:cs="Arial"/>
+          <w:kern w:val="0"/>
+          <w:sz w:val="22"/>
+        </w:rPr>
+        <w:t>(</w:t>
+      </w:r>
+      <w:proofErr w:type="spellStart"/>
+      <w:r>
+        <w:rPr>
+          <w:rFonts w:ascii="Arial" w:hAnsi="Arial" w:cs="Arial"/>
+          <w:kern w:val="0"/>
+          <w:sz w:val="22"/>
+        </w:rPr>
+        <w:t>Vitousek</w:t>
+      </w:r>
+      <w:proofErr w:type="spellEnd"/>
+      <w:r>
+        <w:rPr>
+          <w:rFonts w:ascii="Arial" w:hAnsi="Arial" w:cs="Arial"/>
+          <w:kern w:val="0"/>
+          <w:sz w:val="22"/>
+        </w:rPr>
+        <w:t xml:space="preserve"> </w:t>
+      </w:r>
+      <w:r>
+        <w:rPr>
+          <w:rFonts w:ascii="Arial" w:hAnsi="Arial" w:cs="Arial"/>
+          <w:i/>
+          <w:iCs/>
+          <w:kern w:val="0"/>
+          <w:sz w:val="22"/>
+        </w:rPr>
+        <w:t>et al.</w:t>
+      </w:r>
+      <w:r>
+        <w:rPr>
+          <w:rFonts w:ascii="Arial" w:hAnsi="Arial" w:cs="Arial"/>
+          <w:kern w:val="0"/>
+          <w:sz w:val="22"/>
+        </w:rPr>
+        <w:t xml:space="preserve">, 1997; Regacho and </w:t>
+      </w:r>
+      <w:proofErr w:type="spellStart"/>
+      <w:r>
+        <w:rPr>
+          <w:rFonts w:ascii="Arial" w:hAnsi="Arial" w:cs="Arial"/>
+          <w:kern w:val="0"/>
+          <w:sz w:val="22"/>
+        </w:rPr>
+        <w:t>delBarco</w:t>
+      </w:r>
+      <w:proofErr w:type="spellEnd"/>
+      <w:r>
+        <w:rPr>
+          <w:rFonts w:ascii="Arial" w:hAnsi="Arial" w:cs="Arial"/>
+          <w:kern w:val="0"/>
+          <w:sz w:val="22"/>
+        </w:rPr>
+        <w:t>-Trillo, 2021)</w:t>
+      </w:r>
+      <w:r>
+        <w:rPr>
+          <w:rFonts w:ascii="Arial" w:hAnsi="Arial" w:cs="Arial"/>
+          <w:sz w:val="22"/>
+          <w:szCs w:val="22"/>
+        </w:rPr>
+        <w:fldChar w:fldCharType="end"/>
+      </w:r>
+      <w:r>
+        <w:rPr>
+          <w:rFonts w:ascii="Arial" w:hAnsi="Arial" w:cs="Arial"/>
+          <w:sz w:val="22"/>
+          <w:szCs w:val="22"/>
+        </w:rPr>
+        <w:t xml:space="preserve">. Without temporal analysis, we cannot determine if </w:t>
+      </w:r>
+      <w:r>
+        <w:rPr>
+          <w:rFonts w:ascii="Arial" w:hAnsi="Arial" w:cs="Arial"/>
+          <w:sz w:val="22"/>
+          <w:szCs w:val="22"/>
+        </w:rPr>
+        <w:t xml:space="preserve">phenotypic changes in </w:t>
+      </w:r>
+      <w:r>
+        <w:rPr>
+          <w:rFonts w:ascii="Arial" w:hAnsi="Arial" w:cs="Arial"/>
+          <w:sz w:val="22"/>
+          <w:szCs w:val="22"/>
+        </w:rPr>
+        <w:t xml:space="preserve">the urban populations </w:t>
+      </w:r>
+      <w:r>
+        <w:rPr>
+          <w:rFonts w:ascii="Arial" w:hAnsi="Arial" w:cs="Arial"/>
+          <w:sz w:val="22"/>
+          <w:szCs w:val="22"/>
+        </w:rPr>
+        <w:t xml:space="preserve">are the source of any difference in means, or if they have remained stable and the rural populations have changed. </w:t>
+      </w:r>
+      <w:r>
+        <w:rPr>
+          <w:rFonts w:ascii="Arial" w:hAnsi="Arial" w:cs="Arial"/>
+          <w:sz w:val="22"/>
+          <w:szCs w:val="22"/>
+        </w:rPr>
+        <w:t xml:space="preserve">In fact, Snell-Rood et al found increases in CC over time for four rural populations. </w:t>
+      </w:r>
+      <w:r>
+        <w:rPr>
+          <w:rFonts w:ascii="Arial" w:hAnsi="Arial" w:cs="Arial"/>
+          <w:sz w:val="22"/>
+          <w:szCs w:val="22"/>
+        </w:rPr>
+        <w:t xml:space="preserve">Furthermore, </w:t>
+      </w:r>
+      <w:r>
+        <w:rPr>
+          <w:rFonts w:ascii="Arial" w:hAnsi="Arial" w:cs="Arial"/>
+          <w:sz w:val="22"/>
+          <w:szCs w:val="22"/>
+        </w:rPr>
+        <w:t xml:space="preserve">a sampling bias may be present; perhaps urban individuals with smaller brains are simply more likely to die </w:t>
+      </w:r>
+      <w:r>
+        <w:rPr>
+          <w:rFonts w:ascii="Arial" w:hAnsi="Arial" w:cs="Arial"/>
+          <w:sz w:val="22"/>
+          <w:szCs w:val="22"/>
+        </w:rPr>
+        <w:t>ways that lead</w:t>
+      </w:r>
+      <w:r>
+        <w:rPr>
+          <w:rFonts w:ascii="Arial" w:hAnsi="Arial" w:cs="Arial"/>
+          <w:sz w:val="22"/>
+          <w:szCs w:val="22"/>
+        </w:rPr>
+        <w:t xml:space="preserve"> them to be collected (for example in </w:t>
+      </w:r>
+      <w:r>
+        <w:rPr>
+          <w:rFonts w:ascii="Arial" w:hAnsi="Arial" w:cs="Arial"/>
+          <w:sz w:val="22"/>
+          <w:szCs w:val="22"/>
+        </w:rPr>
+        <w:t xml:space="preserve">densely populated or less covered areas). </w:t>
+      </w:r>
+      <w:r>
+        <w:rPr>
+          <w:rFonts w:ascii="Arial" w:hAnsi="Arial" w:cs="Arial"/>
+          <w:sz w:val="22"/>
+          <w:szCs w:val="22"/>
+        </w:rPr>
+        <w:t xml:space="preserve">It is also a simplification to deem all animals found in urban environments as synanthropes. </w:t>
+      </w:r>
+      <w:r>
+        <w:rPr>
+          <w:rFonts w:ascii="Arial" w:hAnsi="Arial" w:cs="Arial"/>
+          <w:sz w:val="22"/>
+          <w:szCs w:val="22"/>
+        </w:rPr>
+        <w:t>(</w:t>
+      </w:r>
+      <w:r>
+        <w:rPr>
+          <w:rFonts w:ascii="Arial" w:hAnsi="Arial" w:cs="Arial"/>
+          <w:sz w:val="22"/>
+          <w:szCs w:val="22"/>
+        </w:rPr>
+        <w:t>767</w:t>
+      </w:r>
+      <w:r>
+        <w:rPr>
+          <w:rFonts w:ascii="Arial" w:hAnsi="Arial" w:cs="Arial"/>
+          <w:sz w:val="22"/>
+          <w:szCs w:val="22"/>
+        </w:rPr>
+        <w:t xml:space="preserve"> words)</w:t>
+      </w:r>
+    </w:p>
+    <w:p>
+      <w:pPr>
+        <w:spacing w:line="360" w:lineRule="auto"/>
+        <w:jc w:val="both"/>
+        <w:rPr>
+          <w:rFonts w:ascii="Arial" w:hAnsi="Arial" w:cs="Arial"/>
+          <w:sz w:val="22"/>
+          <w:szCs w:val="22"/>
         </w:rPr>
       </w:pPr>
     </w:p>
@@ -11884,259 +13175,6 @@
       <w:pPr>
         <w:pStyle w:val="Heading2"/>
         <w:spacing w:line="360" w:lineRule="auto"/>
-        <w:jc w:val="both"/>
-        <w:rPr>
-          <w:rFonts w:ascii="Arial" w:hAnsi="Arial" w:cs="Arial"/>
-        </w:rPr>
-      </w:pPr>
-      <w:bookmarkStart w:id="7" w:name="_Toc226399182"/>
-      <w:r>
-        <w:rPr>
-          <w:rFonts w:ascii="Arial" w:hAnsi="Arial" w:cs="Arial"/>
-        </w:rPr>
-        <w:t>Discussion</w:t>
-      </w:r>
-      <w:bookmarkEnd w:id="7"/>
-    </w:p>
-    <w:p>
-      <w:pPr>
-        <w:spacing w:line="360" w:lineRule="auto"/>
-        <w:jc w:val="both"/>
-        <w:rPr>
-          <w:rFonts w:ascii="Arial" w:hAnsi="Arial" w:cs="Arial"/>
-          <w:sz w:val="22"/>
-          <w:szCs w:val="22"/>
-        </w:rPr>
-      </w:pPr>
-      <w:r>
-        <w:rPr>
-          <w:rFonts w:ascii="Arial" w:hAnsi="Arial" w:cs="Arial"/>
-          <w:sz w:val="22"/>
-          <w:szCs w:val="22"/>
-        </w:rPr>
-        <w:t xml:space="preserve">While this systematic review did not find a significant trend in relative CC </w:t>
-      </w:r>
-      <w:r>
-        <w:rPr>
-          <w:rFonts w:ascii="Arial" w:hAnsi="Arial" w:cs="Arial"/>
-          <w:sz w:val="22"/>
-          <w:szCs w:val="22"/>
-        </w:rPr>
-        <w:t xml:space="preserve">between urban and rural populations, the overall effect size as well as the majority of those extracted were negative. </w:t>
-      </w:r>
-    </w:p>
-    <w:p>
-      <w:pPr>
-        <w:spacing w:line="360" w:lineRule="auto"/>
-        <w:jc w:val="both"/>
-        <w:rPr>
-          <w:rFonts w:ascii="Arial" w:hAnsi="Arial" w:cs="Arial"/>
-          <w:sz w:val="22"/>
-          <w:szCs w:val="22"/>
-        </w:rPr>
-      </w:pPr>
-    </w:p>
-    <w:p>
-      <w:pPr>
-        <w:spacing w:line="360" w:lineRule="auto"/>
-        <w:jc w:val="both"/>
-        <w:rPr>
-          <w:rFonts w:ascii="Arial" w:hAnsi="Arial" w:cs="Arial"/>
-          <w:sz w:val="22"/>
-          <w:szCs w:val="22"/>
-        </w:rPr>
-      </w:pPr>
-      <w:r>
-        <w:rPr>
-          <w:rFonts w:ascii="Arial" w:hAnsi="Arial" w:cs="Arial"/>
-          <w:sz w:val="22"/>
-          <w:szCs w:val="22"/>
-        </w:rPr>
-        <w:t>D</w:t>
-      </w:r>
-      <w:r>
-        <w:rPr>
-          <w:rFonts w:ascii="Arial" w:hAnsi="Arial" w:cs="Arial"/>
-          <w:sz w:val="22"/>
-          <w:szCs w:val="22"/>
-        </w:rPr>
-        <w:t>iscussion</w:t>
-      </w:r>
-    </w:p>
-    <w:p>
-      <w:pPr>
-        <w:spacing w:line="360" w:lineRule="auto"/>
-        <w:jc w:val="both"/>
-        <w:rPr>
-          <w:rFonts w:ascii="Arial" w:hAnsi="Arial" w:cs="Arial"/>
-          <w:sz w:val="22"/>
-          <w:szCs w:val="22"/>
-        </w:rPr>
-      </w:pPr>
-      <w:r>
-        <w:rPr>
-          <w:rFonts w:ascii="Arial" w:hAnsi="Arial" w:cs="Arial"/>
-          <w:sz w:val="22"/>
-          <w:szCs w:val="22"/>
-        </w:rPr>
-        <w:t>Rural populations also under selection – nowhere truly wild in America</w:t>
-      </w:r>
-      <w:r>
-        <w:rPr>
-          <w:rFonts w:ascii="Arial" w:hAnsi="Arial" w:cs="Arial"/>
-          <w:sz w:val="22"/>
-          <w:szCs w:val="22"/>
-        </w:rPr>
-        <w:t xml:space="preserve"> and everything has been evolving for the exact same amount of time – without genetic comparison hard to say if selection </w:t>
-      </w:r>
-    </w:p>
-    <w:p>
-      <w:pPr>
-        <w:spacing w:line="360" w:lineRule="auto"/>
-        <w:jc w:val="both"/>
-        <w:rPr>
-          <w:rFonts w:ascii="Arial" w:hAnsi="Arial" w:cs="Arial"/>
-          <w:sz w:val="22"/>
-          <w:szCs w:val="22"/>
-        </w:rPr>
-      </w:pPr>
-    </w:p>
-    <w:p>
-      <w:pPr>
-        <w:spacing w:line="360" w:lineRule="auto"/>
-        <w:jc w:val="both"/>
-        <w:rPr>
-          <w:rFonts w:ascii="Arial" w:hAnsi="Arial" w:cs="Arial"/>
-          <w:sz w:val="22"/>
-          <w:szCs w:val="22"/>
-        </w:rPr>
-      </w:pPr>
-    </w:p>
-    <w:p>
-      <w:pPr>
-        <w:spacing w:line="360" w:lineRule="auto"/>
-        <w:jc w:val="both"/>
-        <w:rPr>
-          <w:rFonts w:ascii="Arial" w:hAnsi="Arial" w:cs="Arial"/>
-          <w:sz w:val="22"/>
-          <w:szCs w:val="22"/>
-        </w:rPr>
-      </w:pPr>
-    </w:p>
-    <w:p>
-      <w:pPr>
-        <w:spacing w:line="360" w:lineRule="auto"/>
-        <w:jc w:val="both"/>
-        <w:rPr>
-          <w:rFonts w:ascii="Arial" w:hAnsi="Arial" w:cs="Arial"/>
-          <w:sz w:val="22"/>
-          <w:szCs w:val="22"/>
-        </w:rPr>
-      </w:pPr>
-    </w:p>
-    <w:p>
-      <w:pPr>
-        <w:spacing w:line="360" w:lineRule="auto"/>
-        <w:jc w:val="both"/>
-        <w:rPr>
-          <w:rFonts w:ascii="Arial" w:hAnsi="Arial" w:cs="Arial"/>
-          <w:sz w:val="22"/>
-          <w:szCs w:val="22"/>
-        </w:rPr>
-      </w:pPr>
-    </w:p>
-    <w:p>
-      <w:pPr>
-        <w:spacing w:line="360" w:lineRule="auto"/>
-        <w:jc w:val="both"/>
-        <w:rPr>
-          <w:rFonts w:ascii="Arial" w:hAnsi="Arial" w:cs="Arial"/>
-          <w:sz w:val="22"/>
-          <w:szCs w:val="22"/>
-        </w:rPr>
-      </w:pPr>
-    </w:p>
-    <w:p>
-      <w:pPr>
-        <w:spacing w:line="360" w:lineRule="auto"/>
-        <w:jc w:val="both"/>
-        <w:rPr>
-          <w:rFonts w:ascii="Arial" w:hAnsi="Arial" w:cs="Arial"/>
-          <w:sz w:val="22"/>
-          <w:szCs w:val="22"/>
-        </w:rPr>
-      </w:pPr>
-    </w:p>
-    <w:p>
-      <w:pPr>
-        <w:spacing w:line="360" w:lineRule="auto"/>
-        <w:jc w:val="both"/>
-        <w:rPr>
-          <w:rFonts w:ascii="Arial" w:hAnsi="Arial" w:cs="Arial"/>
-          <w:sz w:val="22"/>
-          <w:szCs w:val="22"/>
-        </w:rPr>
-      </w:pPr>
-    </w:p>
-    <w:p>
-      <w:pPr>
-        <w:spacing w:line="360" w:lineRule="auto"/>
-        <w:jc w:val="both"/>
-        <w:rPr>
-          <w:rFonts w:ascii="Arial" w:hAnsi="Arial" w:cs="Arial"/>
-          <w:sz w:val="22"/>
-          <w:szCs w:val="22"/>
-        </w:rPr>
-      </w:pPr>
-    </w:p>
-    <w:p>
-      <w:pPr>
-        <w:spacing w:line="360" w:lineRule="auto"/>
-        <w:jc w:val="both"/>
-        <w:rPr>
-          <w:rFonts w:ascii="Arial" w:hAnsi="Arial" w:cs="Arial"/>
-          <w:sz w:val="22"/>
-          <w:szCs w:val="22"/>
-        </w:rPr>
-      </w:pPr>
-    </w:p>
-    <w:p>
-      <w:pPr>
-        <w:spacing w:line="360" w:lineRule="auto"/>
-        <w:jc w:val="both"/>
-        <w:rPr>
-          <w:rFonts w:ascii="Arial" w:hAnsi="Arial" w:cs="Arial"/>
-          <w:sz w:val="22"/>
-          <w:szCs w:val="22"/>
-        </w:rPr>
-      </w:pPr>
-    </w:p>
-    <w:p>
-      <w:pPr>
-        <w:spacing w:line="360" w:lineRule="auto"/>
-        <w:jc w:val="both"/>
-        <w:rPr>
-          <w:rFonts w:ascii="Arial" w:hAnsi="Arial" w:cs="Arial"/>
-          <w:sz w:val="22"/>
-          <w:szCs w:val="22"/>
-        </w:rPr>
-      </w:pPr>
-    </w:p>
-    <w:p>
-      <w:pPr>
-        <w:spacing w:line="360" w:lineRule="auto"/>
-        <w:jc w:val="both"/>
-        <w:rPr>
-          <w:rFonts w:ascii="Arial" w:hAnsi="Arial" w:cs="Arial"/>
-          <w:sz w:val="22"/>
-          <w:szCs w:val="22"/>
-        </w:rPr>
-      </w:pPr>
-    </w:p>
-    <w:p>
-      <w:pPr>
-        <w:pStyle w:val="Heading2"/>
-        <w:spacing w:line="360" w:lineRule="auto"/>
         <w:rPr>
           <w:rFonts w:ascii="Arial" w:hAnsi="Arial" w:cs="Arial"/>
         </w:rPr>
@@ -12146,6 +13184,7 @@
         <w:rPr>
           <w:rFonts w:ascii="Arial" w:hAnsi="Arial" w:cs="Arial"/>
         </w:rPr>
+        <w:lastRenderedPageBreak/>
         <w:t>References</w:t>
       </w:r>
       <w:bookmarkEnd w:id="8"/>
@@ -12315,7 +13354,23 @@
           <w:rFonts w:ascii="Arial" w:hAnsi="Arial" w:cs="Arial"/>
           <w:sz w:val="22"/>
         </w:rPr>
-        <w:t xml:space="preserve"> (2021) ‘Ivory poaching and the rapid evolution of tusklessness in African elephants’, </w:t>
+        <w:t xml:space="preserve"> (2021) ‘Ivory poaching and the rapid evolution of </w:t>
+      </w:r>
+      <w:proofErr w:type="spellStart"/>
+      <w:r>
+        <w:rPr>
+          <w:rFonts w:ascii="Arial" w:hAnsi="Arial" w:cs="Arial"/>
+          <w:sz w:val="22"/>
+        </w:rPr>
+        <w:t>tusklessness</w:t>
+      </w:r>
+      <w:proofErr w:type="spellEnd"/>
+      <w:r>
+        <w:rPr>
+          <w:rFonts w:ascii="Arial" w:hAnsi="Arial" w:cs="Arial"/>
+          <w:sz w:val="22"/>
+        </w:rPr>
+        <w:t xml:space="preserve"> in African elephants’, </w:t>
       </w:r>
       <w:r>
         <w:rPr>
@@ -12475,7 +13530,7 @@
           <w:rFonts w:ascii="Arial" w:hAnsi="Arial" w:cs="Arial"/>
           <w:sz w:val="22"/>
         </w:rPr>
-        <w:t xml:space="preserve">Freedman, A.H., Lohmueller, K.E. and Wayne, R.K. (2016) ‘Evolutionary History, Selective Sweeps, and Deleterious Variation in the Dog’, </w:t>
+        <w:t xml:space="preserve">Farley, S.S. </w:t>
       </w:r>
       <w:r>
         <w:rPr>
@@ -12484,14 +13539,32 @@
           <w:iCs/>
           <w:sz w:val="22"/>
         </w:rPr>
-        <w:t>Annual Review of Ecology, Evolution, and Systematics</w:t>
-      </w:r>
-      <w:r>
-        <w:rPr>
-          <w:rFonts w:ascii="Arial" w:hAnsi="Arial" w:cs="Arial"/>
-          <w:sz w:val="22"/>
-        </w:rPr>
-        <w:t>, 47(Volume 47, 2016), pp. 73–96. Available at: https://doi.org/10.1146/annurev-ecolsys-121415-032155.</w:t>
+        <w:t>et al.</w:t>
+      </w:r>
+      <w:r>
+        <w:rPr>
+          <w:rFonts w:ascii="Arial" w:hAnsi="Arial" w:cs="Arial"/>
+          <w:sz w:val="22"/>
+        </w:rPr>
+        <w:t xml:space="preserve"> (2018) ‘Situating Ecology as a Big-Data Science: Current Advances, Challenges, and Solutions’, </w:t>
+      </w:r>
+      <w:proofErr w:type="spellStart"/>
+      <w:r>
+        <w:rPr>
+          <w:rFonts w:ascii="Arial" w:hAnsi="Arial" w:cs="Arial"/>
+          <w:i/>
+          <w:iCs/>
+          <w:sz w:val="22"/>
+        </w:rPr>
+        <w:t>BioScience</w:t>
+      </w:r>
+      <w:proofErr w:type="spellEnd"/>
+      <w:r>
+        <w:rPr>
+          <w:rFonts w:ascii="Arial" w:hAnsi="Arial" w:cs="Arial"/>
+          <w:sz w:val="22"/>
+        </w:rPr>
+        <w:t>, 68(8), pp. 563–576. Available at: https://doi.org/10.1093/biosci/biy068.</w:t>
       </w:r>
     </w:p>
     <w:p>
@@ -12507,7 +13580,23 @@
           <w:rFonts w:ascii="Arial" w:hAnsi="Arial" w:cs="Arial"/>
           <w:sz w:val="22"/>
         </w:rPr>
-        <w:t xml:space="preserve">Hedges, L.V. (1981) ‘Distribution Theory for Glass’s Estimator of Effect Size and Related Estimators’, </w:t>
+        <w:t xml:space="preserve">Freedman, A.H., </w:t>
+      </w:r>
+      <w:proofErr w:type="spellStart"/>
+      <w:r>
+        <w:rPr>
+          <w:rFonts w:ascii="Arial" w:hAnsi="Arial" w:cs="Arial"/>
+          <w:sz w:val="22"/>
+        </w:rPr>
+        <w:t>Lohmueller</w:t>
+      </w:r>
+      <w:proofErr w:type="spellEnd"/>
+      <w:r>
+        <w:rPr>
+          <w:rFonts w:ascii="Arial" w:hAnsi="Arial" w:cs="Arial"/>
+          <w:sz w:val="22"/>
+        </w:rPr>
+        <w:t xml:space="preserve">, K.E. and Wayne, R.K. (2016) ‘Evolutionary History, Selective Sweeps, and Deleterious Variation in the Dog’, </w:t>
       </w:r>
       <w:r>
         <w:rPr>
@@ -12516,14 +13605,14 @@
           <w:iCs/>
           <w:sz w:val="22"/>
         </w:rPr>
-        <w:t>Journal of Educational Statistics</w:t>
-      </w:r>
-      <w:r>
-        <w:rPr>
-          <w:rFonts w:ascii="Arial" w:hAnsi="Arial" w:cs="Arial"/>
-          <w:sz w:val="22"/>
-        </w:rPr>
-        <w:t>, 6(2), pp. 107–128. Available at: https://doi.org/10.2307/1164588.</w:t>
+        <w:t>Annual Review of Ecology, Evolution, and Systematics</w:t>
+      </w:r>
+      <w:r>
+        <w:rPr>
+          <w:rFonts w:ascii="Arial" w:hAnsi="Arial" w:cs="Arial"/>
+          <w:sz w:val="22"/>
+        </w:rPr>
+        <w:t>, 47(Volume 47, 2016), pp. 73–96. Available at: https://doi.org/10.1146/annurev-ecolsys-121415-032155.</w:t>
       </w:r>
     </w:p>
     <w:p>
@@ -12539,7 +13628,7 @@
           <w:rFonts w:ascii="Arial" w:hAnsi="Arial" w:cs="Arial"/>
           <w:sz w:val="22"/>
         </w:rPr>
-        <w:t xml:space="preserve">Johnson-Ulrich, L. and Forss, S. (2025) ‘How cognitively demanding is the urban niche? Reconsidering exaptation and habituation’, </w:t>
+        <w:t xml:space="preserve">Hedges, L.V. (1981) ‘Distribution Theory for Glass’s Estimator of Effect Size and Related Estimators’, </w:t>
       </w:r>
       <w:r>
         <w:rPr>
@@ -12548,14 +13637,14 @@
           <w:iCs/>
           <w:sz w:val="22"/>
         </w:rPr>
-        <w:t>Animal Cognition</w:t>
-      </w:r>
-      <w:r>
-        <w:rPr>
-          <w:rFonts w:ascii="Arial" w:hAnsi="Arial" w:cs="Arial"/>
-          <w:sz w:val="22"/>
-        </w:rPr>
-        <w:t>, 28(1), p. 48. Available at: https://doi.org/10.1007/s10071-025-01965-y.</w:t>
+        <w:t>Journal of Educational Statistics</w:t>
+      </w:r>
+      <w:r>
+        <w:rPr>
+          <w:rFonts w:ascii="Arial" w:hAnsi="Arial" w:cs="Arial"/>
+          <w:sz w:val="22"/>
+        </w:rPr>
+        <w:t>, 6(2), pp. 107–128. Available at: https://doi.org/10.2307/1164588.</w:t>
       </w:r>
     </w:p>
     <w:p>
@@ -12571,7 +13660,7 @@
           <w:rFonts w:ascii="Arial" w:hAnsi="Arial" w:cs="Arial"/>
           <w:sz w:val="22"/>
         </w:rPr>
-        <w:t xml:space="preserve">Leach, H.M. (2007) ‘Selection and the Unforeseen Consequences of Domestication’, </w:t>
+        <w:t xml:space="preserve">Johnson-Ulrich, L. and Forss, S. (2025) ‘How cognitively demanding is the urban niche? Reconsidering exaptation and habituation’, </w:t>
       </w:r>
       <w:r>
         <w:rPr>
@@ -12580,14 +13669,14 @@
           <w:iCs/>
           <w:sz w:val="22"/>
         </w:rPr>
-        <w:t>Where the Wild Things Are Now: Domestication Reconsidered</w:t>
-      </w:r>
-      <w:r>
-        <w:rPr>
-          <w:rFonts w:ascii="Arial" w:hAnsi="Arial" w:cs="Arial"/>
-          <w:sz w:val="22"/>
-        </w:rPr>
-        <w:t>. Oxford, UK: Berg Publishers, pp. 71–95.</w:t>
+        <w:t>Animal Cognition</w:t>
+      </w:r>
+      <w:r>
+        <w:rPr>
+          <w:rFonts w:ascii="Arial" w:hAnsi="Arial" w:cs="Arial"/>
+          <w:sz w:val="22"/>
+        </w:rPr>
+        <w:t>, 28(1), p. 48. Available at: https://doi.org/10.1007/s10071-025-01965-y.</w:t>
       </w:r>
     </w:p>
     <w:p>
@@ -12603,7 +13692,7 @@
           <w:rFonts w:ascii="Arial" w:hAnsi="Arial" w:cs="Arial"/>
           <w:sz w:val="22"/>
         </w:rPr>
-        <w:t xml:space="preserve">Lee, V.E. and Thornton, A. (2021) ‘Animal Cognition in an Urbanised World’, </w:t>
+        <w:t xml:space="preserve">Leach, H.M. (2007) ‘Selection and the Unforeseen Consequences of Domestication’, </w:t>
       </w:r>
       <w:r>
         <w:rPr>
@@ -12612,14 +13701,14 @@
           <w:iCs/>
           <w:sz w:val="22"/>
         </w:rPr>
-        <w:t>Frontiers in Ecology and Evolution</w:t>
-      </w:r>
-      <w:r>
-        <w:rPr>
-          <w:rFonts w:ascii="Arial" w:hAnsi="Arial" w:cs="Arial"/>
-          <w:sz w:val="22"/>
-        </w:rPr>
-        <w:t>, 9. Available at: https://doi.org/10.3389/fevo.2021.633947.</w:t>
+        <w:t>Where the Wild Things Are Now: Domestication Reconsidered</w:t>
+      </w:r>
+      <w:r>
+        <w:rPr>
+          <w:rFonts w:ascii="Arial" w:hAnsi="Arial" w:cs="Arial"/>
+          <w:sz w:val="22"/>
+        </w:rPr>
+        <w:t>. Oxford, UK: Berg Publishers, pp. 71–95.</w:t>
       </w:r>
     </w:p>
     <w:p>
@@ -12635,8 +13724,7 @@
           <w:rFonts w:ascii="Arial" w:hAnsi="Arial" w:cs="Arial"/>
           <w:sz w:val="22"/>
         </w:rPr>
-        <w:lastRenderedPageBreak/>
-        <w:t xml:space="preserve">Lopez, R. (2026) </w:t>
+        <w:t xml:space="preserve">Lee, V.E. and Thornton, A. (2021) ‘Animal Cognition in an Urbanised World’, </w:t>
       </w:r>
       <w:r>
         <w:rPr>
@@ -12645,30 +13733,14 @@
           <w:iCs/>
           <w:sz w:val="22"/>
         </w:rPr>
-        <w:t>PRISMA Flow Diagram for Systematic Reviews</w:t>
-      </w:r>
-      <w:r>
-        <w:rPr>
-          <w:rFonts w:ascii="Arial" w:hAnsi="Arial" w:cs="Arial"/>
-          <w:sz w:val="22"/>
-        </w:rPr>
-        <w:t xml:space="preserve">, </w:t>
-      </w:r>
-      <w:r>
-        <w:rPr>
-          <w:rFonts w:ascii="Arial" w:hAnsi="Arial" w:cs="Arial"/>
-          <w:i/>
-          <w:iCs/>
-          <w:sz w:val="22"/>
-        </w:rPr>
-        <w:t>BioRender</w:t>
-      </w:r>
-      <w:r>
-        <w:rPr>
-          <w:rFonts w:ascii="Arial" w:hAnsi="Arial" w:cs="Arial"/>
-          <w:sz w:val="22"/>
-        </w:rPr>
-        <w:t>. Available at: https://app.biorender.com/profile/template/details/t-6423014adab558c8916c750a-prisma-flow-diagram-for-systematic-reviews/?source=profile&amp;username=rosalba_lopez&amp;tab=templates (Accessed: 2 April 2026).</w:t>
+        <w:t>Frontiers in Ecology and Evolution</w:t>
+      </w:r>
+      <w:r>
+        <w:rPr>
+          <w:rFonts w:ascii="Arial" w:hAnsi="Arial" w:cs="Arial"/>
+          <w:sz w:val="22"/>
+        </w:rPr>
+        <w:t>, 9. Available at: https://doi.org/10.3389/fevo.2021.633947.</w:t>
       </w:r>
     </w:p>
     <w:p>
@@ -12684,7 +13756,7 @@
           <w:rFonts w:ascii="Arial" w:hAnsi="Arial" w:cs="Arial"/>
           <w:sz w:val="22"/>
         </w:rPr>
-        <w:t xml:space="preserve">Lord, K.A. </w:t>
+        <w:t xml:space="preserve">Lopez, R. (2026) </w:t>
       </w:r>
       <w:r>
         <w:rPr>
@@ -12693,15 +13765,16 @@
           <w:iCs/>
           <w:sz w:val="22"/>
         </w:rPr>
-        <w:t>et al.</w:t>
-      </w:r>
-      <w:r>
-        <w:rPr>
-          <w:rFonts w:ascii="Arial" w:hAnsi="Arial" w:cs="Arial"/>
-          <w:sz w:val="22"/>
-        </w:rPr>
-        <w:t xml:space="preserve"> (2020) ‘The History of Farm Foxes Undermines the Animal Domestication Syndrome’, </w:t>
-      </w:r>
+        <w:t>PRISMA Flow Diagram for Systematic Reviews</w:t>
+      </w:r>
+      <w:r>
+        <w:rPr>
+          <w:rFonts w:ascii="Arial" w:hAnsi="Arial" w:cs="Arial"/>
+          <w:sz w:val="22"/>
+        </w:rPr>
+        <w:t xml:space="preserve">, </w:t>
+      </w:r>
+      <w:proofErr w:type="spellStart"/>
       <w:r>
         <w:rPr>
           <w:rFonts w:ascii="Arial" w:hAnsi="Arial" w:cs="Arial"/>
@@ -12709,14 +13782,15 @@
           <w:iCs/>
           <w:sz w:val="22"/>
         </w:rPr>
-        <w:t>Trends in Ecology &amp; Evolution</w:t>
-      </w:r>
-      <w:r>
-        <w:rPr>
-          <w:rFonts w:ascii="Arial" w:hAnsi="Arial" w:cs="Arial"/>
-          <w:sz w:val="22"/>
-        </w:rPr>
-        <w:t>, 35(2), pp. 125–136. Available at: https://doi.org/10.1016/j.tree.2019.10.011.</w:t>
+        <w:t>BioRender</w:t>
+      </w:r>
+      <w:proofErr w:type="spellEnd"/>
+      <w:r>
+        <w:rPr>
+          <w:rFonts w:ascii="Arial" w:hAnsi="Arial" w:cs="Arial"/>
+          <w:sz w:val="22"/>
+        </w:rPr>
+        <w:t>. Available at: https://app.biorender.com/profile/template/details/t-6423014adab558c8916c750a-prisma-flow-diagram-for-systematic-reviews/?source=profile&amp;username=rosalba_lopez&amp;tab=templates (Accessed: 2 April 2026).</w:t>
       </w:r>
     </w:p>
     <w:p>
@@ -12732,7 +13806,8 @@
           <w:rFonts w:ascii="Arial" w:hAnsi="Arial" w:cs="Arial"/>
           <w:sz w:val="22"/>
         </w:rPr>
-        <w:t xml:space="preserve">Maune, A.L., Caspers, B.A. and Damas-Moreira, I. (2026) ‘The impact of urbanisation on social behaviour: a comprehensive review’, </w:t>
+        <w:lastRenderedPageBreak/>
+        <w:t xml:space="preserve">Lord, K.A. </w:t>
       </w:r>
       <w:r>
         <w:rPr>
@@ -12741,14 +13816,30 @@
           <w:iCs/>
           <w:sz w:val="22"/>
         </w:rPr>
-        <w:t>Biological Reviews</w:t>
-      </w:r>
-      <w:r>
-        <w:rPr>
-          <w:rFonts w:ascii="Arial" w:hAnsi="Arial" w:cs="Arial"/>
-          <w:sz w:val="22"/>
-        </w:rPr>
-        <w:t>, 101(2), pp. 1003–1035. Available at: https://doi.org/10.1002/brv.70113.</w:t>
+        <w:t>et al.</w:t>
+      </w:r>
+      <w:r>
+        <w:rPr>
+          <w:rFonts w:ascii="Arial" w:hAnsi="Arial" w:cs="Arial"/>
+          <w:sz w:val="22"/>
+        </w:rPr>
+        <w:t xml:space="preserve"> (2020) ‘The History of Farm Foxes Undermines the Animal Domestication Syndrome’, </w:t>
+      </w:r>
+      <w:r>
+        <w:rPr>
+          <w:rFonts w:ascii="Arial" w:hAnsi="Arial" w:cs="Arial"/>
+          <w:i/>
+          <w:iCs/>
+          <w:sz w:val="22"/>
+        </w:rPr>
+        <w:t>Trends in Ecology &amp; Evolution</w:t>
+      </w:r>
+      <w:r>
+        <w:rPr>
+          <w:rFonts w:ascii="Arial" w:hAnsi="Arial" w:cs="Arial"/>
+          <w:sz w:val="22"/>
+        </w:rPr>
+        <w:t>, 35(2), pp. 125–136. Available at: https://doi.org/10.1016/j.tree.2019.10.011.</w:t>
       </w:r>
     </w:p>
     <w:p>
@@ -12764,7 +13855,7 @@
           <w:rFonts w:ascii="Arial" w:hAnsi="Arial" w:cs="Arial"/>
           <w:sz w:val="22"/>
         </w:rPr>
-        <w:t xml:space="preserve">Page, M.J. </w:t>
+        <w:t xml:space="preserve">Maune, A.L., Caspers, B.A. and Damas-Moreira, I. (2026) ‘The impact of urbanisation on social behaviour: a comprehensive review’, </w:t>
       </w:r>
       <w:r>
         <w:rPr>
@@ -12773,30 +13864,14 @@
           <w:iCs/>
           <w:sz w:val="22"/>
         </w:rPr>
-        <w:t>et al.</w:t>
-      </w:r>
-      <w:r>
-        <w:rPr>
-          <w:rFonts w:ascii="Arial" w:hAnsi="Arial" w:cs="Arial"/>
-          <w:sz w:val="22"/>
-        </w:rPr>
-        <w:t xml:space="preserve"> (2021) ‘The PRISMA 2020 statement: an updated guideline for reporting systematic reviews’, </w:t>
-      </w:r>
-      <w:r>
-        <w:rPr>
-          <w:rFonts w:ascii="Arial" w:hAnsi="Arial" w:cs="Arial"/>
-          <w:i/>
-          <w:iCs/>
-          <w:sz w:val="22"/>
-        </w:rPr>
-        <w:t>BMJ</w:t>
-      </w:r>
-      <w:r>
-        <w:rPr>
-          <w:rFonts w:ascii="Arial" w:hAnsi="Arial" w:cs="Arial"/>
-          <w:sz w:val="22"/>
-        </w:rPr>
-        <w:t>, 372, p. n71. Available at: https://doi.org/10.1136/bmj.n71.</w:t>
+        <w:t>Biological Reviews</w:t>
+      </w:r>
+      <w:r>
+        <w:rPr>
+          <w:rFonts w:ascii="Arial" w:hAnsi="Arial" w:cs="Arial"/>
+          <w:sz w:val="22"/>
+        </w:rPr>
+        <w:t>, 101(2), pp. 1003–1035. Available at: https://doi.org/10.1002/brv.70113.</w:t>
       </w:r>
     </w:p>
     <w:p>
@@ -12812,7 +13887,7 @@
           <w:rFonts w:ascii="Arial" w:hAnsi="Arial" w:cs="Arial"/>
           <w:sz w:val="22"/>
         </w:rPr>
-        <w:t xml:space="preserve">Parsons, K.J. </w:t>
+        <w:t xml:space="preserve">Page, M.J. </w:t>
       </w:r>
       <w:r>
         <w:rPr>
@@ -12828,7 +13903,7 @@
           <w:rFonts w:ascii="Arial" w:hAnsi="Arial" w:cs="Arial"/>
           <w:sz w:val="22"/>
         </w:rPr>
-        <w:t xml:space="preserve"> (2020) ‘Skull morphology diverges between urban and rural populations of red foxes mirroring patterns of domestication and macroevolution’, </w:t>
+        <w:t xml:space="preserve"> (2021) ‘The PRISMA 2020 statement: an updated guideline for reporting systematic reviews’, </w:t>
       </w:r>
       <w:r>
         <w:rPr>
@@ -12837,14 +13912,14 @@
           <w:iCs/>
           <w:sz w:val="22"/>
         </w:rPr>
-        <w:t>Proceedings of the Royal Society B: Biological Sciences</w:t>
-      </w:r>
-      <w:r>
-        <w:rPr>
-          <w:rFonts w:ascii="Arial" w:hAnsi="Arial" w:cs="Arial"/>
-          <w:sz w:val="22"/>
-        </w:rPr>
-        <w:t>, 287(1928), p. 20200763. Available at: https://doi.org/10.1098/rspb.2020.0763.</w:t>
+        <w:t>BMJ</w:t>
+      </w:r>
+      <w:r>
+        <w:rPr>
+          <w:rFonts w:ascii="Arial" w:hAnsi="Arial" w:cs="Arial"/>
+          <w:sz w:val="22"/>
+        </w:rPr>
+        <w:t>, 372, p. n71. Available at: https://doi.org/10.1136/bmj.n71.</w:t>
       </w:r>
     </w:p>
     <w:p>
@@ -12860,7 +13935,7 @@
           <w:rFonts w:ascii="Arial" w:hAnsi="Arial" w:cs="Arial"/>
           <w:sz w:val="22"/>
         </w:rPr>
-        <w:t xml:space="preserve">Pierotti, R. and Fogg, B.R. (2018) ‘Review of The First Domestication: How Wolves and Humans Coevolved’, </w:t>
+        <w:t xml:space="preserve">Parsons, K.J. </w:t>
       </w:r>
       <w:r>
         <w:rPr>
@@ -12869,14 +13944,30 @@
           <w:iCs/>
           <w:sz w:val="22"/>
         </w:rPr>
-        <w:t>Ethnobiology Letters</w:t>
-      </w:r>
-      <w:r>
-        <w:rPr>
-          <w:rFonts w:ascii="Arial" w:hAnsi="Arial" w:cs="Arial"/>
-          <w:sz w:val="22"/>
-        </w:rPr>
-        <w:t>, 9(2), pp. 247–249.</w:t>
+        <w:t>et al.</w:t>
+      </w:r>
+      <w:r>
+        <w:rPr>
+          <w:rFonts w:ascii="Arial" w:hAnsi="Arial" w:cs="Arial"/>
+          <w:sz w:val="22"/>
+        </w:rPr>
+        <w:t xml:space="preserve"> (2020) ‘Skull morphology diverges between urban and rural populations of red foxes mirroring patterns of domestication and macroevolution’, </w:t>
+      </w:r>
+      <w:r>
+        <w:rPr>
+          <w:rFonts w:ascii="Arial" w:hAnsi="Arial" w:cs="Arial"/>
+          <w:i/>
+          <w:iCs/>
+          <w:sz w:val="22"/>
+        </w:rPr>
+        <w:t>Proceedings of the Royal Society B: Biological Sciences</w:t>
+      </w:r>
+      <w:r>
+        <w:rPr>
+          <w:rFonts w:ascii="Arial" w:hAnsi="Arial" w:cs="Arial"/>
+          <w:sz w:val="22"/>
+        </w:rPr>
+        <w:t>, 287(1928), p. 20200763. Available at: https://doi.org/10.1098/rspb.2020.0763.</w:t>
       </w:r>
     </w:p>
     <w:p>
@@ -12892,7 +13983,23 @@
           <w:rFonts w:ascii="Arial" w:hAnsi="Arial" w:cs="Arial"/>
           <w:sz w:val="22"/>
         </w:rPr>
-        <w:t>Regacho, T. and delBarco-Trillo, J. (2021) ‘Morphological Stability of Rural Populations Confirms Their Use As Controls in Urban Ecology Studies’. Research Square. Available at: https://doi.org/10.21203/rs.3.rs-795506/v1.</w:t>
+        <w:t xml:space="preserve">Pierotti, R. and Fogg, B.R. (2018) ‘Review of The First Domestication: How Wolves and Humans Coevolved’, </w:t>
+      </w:r>
+      <w:r>
+        <w:rPr>
+          <w:rFonts w:ascii="Arial" w:hAnsi="Arial" w:cs="Arial"/>
+          <w:i/>
+          <w:iCs/>
+          <w:sz w:val="22"/>
+        </w:rPr>
+        <w:t>Ethnobiology Letters</w:t>
+      </w:r>
+      <w:r>
+        <w:rPr>
+          <w:rFonts w:ascii="Arial" w:hAnsi="Arial" w:cs="Arial"/>
+          <w:sz w:val="22"/>
+        </w:rPr>
+        <w:t>, 9(2), pp. 247–249.</w:t>
       </w:r>
     </w:p>
     <w:p>
@@ -12908,39 +14015,39 @@
           <w:rFonts w:ascii="Arial" w:hAnsi="Arial" w:cs="Arial"/>
           <w:sz w:val="22"/>
         </w:rPr>
-        <w:t xml:space="preserve">Schreiber, M. </w:t>
-      </w:r>
-      <w:r>
-        <w:rPr>
-          <w:rFonts w:ascii="Arial" w:hAnsi="Arial" w:cs="Arial"/>
-          <w:i/>
-          <w:iCs/>
-          <w:sz w:val="22"/>
-        </w:rPr>
-        <w:t>et al.</w:t>
-      </w:r>
-      <w:r>
-        <w:rPr>
-          <w:rFonts w:ascii="Arial" w:hAnsi="Arial" w:cs="Arial"/>
-          <w:sz w:val="22"/>
-        </w:rPr>
-        <w:t xml:space="preserve"> (2021) ‘Evolution and Domestication of Rye’, in M.T. Rabanus-Wallace and N. Stein (eds) </w:t>
-      </w:r>
-      <w:r>
-        <w:rPr>
-          <w:rFonts w:ascii="Arial" w:hAnsi="Arial" w:cs="Arial"/>
-          <w:i/>
-          <w:iCs/>
-          <w:sz w:val="22"/>
-        </w:rPr>
-        <w:t>The Rye Genome</w:t>
-      </w:r>
-      <w:r>
-        <w:rPr>
-          <w:rFonts w:ascii="Arial" w:hAnsi="Arial" w:cs="Arial"/>
-          <w:sz w:val="22"/>
-        </w:rPr>
-        <w:t>. Cham: Springer International Publishing, pp. 85–100. Available at: https://doi.org/10.1007/978-3-030-83383-1_6.</w:t>
+        <w:t xml:space="preserve">Regacho, T. and </w:t>
+      </w:r>
+      <w:proofErr w:type="spellStart"/>
+      <w:r>
+        <w:rPr>
+          <w:rFonts w:ascii="Arial" w:hAnsi="Arial" w:cs="Arial"/>
+          <w:sz w:val="22"/>
+        </w:rPr>
+        <w:t>delBarco</w:t>
+      </w:r>
+      <w:proofErr w:type="spellEnd"/>
+      <w:r>
+        <w:rPr>
+          <w:rFonts w:ascii="Arial" w:hAnsi="Arial" w:cs="Arial"/>
+          <w:sz w:val="22"/>
+        </w:rPr>
+        <w:t xml:space="preserve">-Trillo, J. (2021) ‘Morphological Stability of Rural Populations Confirms Their Use </w:t>
+      </w:r>
+      <w:proofErr w:type="gramStart"/>
+      <w:r>
+        <w:rPr>
+          <w:rFonts w:ascii="Arial" w:hAnsi="Arial" w:cs="Arial"/>
+          <w:sz w:val="22"/>
+        </w:rPr>
+        <w:t>As</w:t>
+      </w:r>
+      <w:proofErr w:type="gramEnd"/>
+      <w:r>
+        <w:rPr>
+          <w:rFonts w:ascii="Arial" w:hAnsi="Arial" w:cs="Arial"/>
+          <w:sz w:val="22"/>
+        </w:rPr>
+        <w:t xml:space="preserve"> Controls in Urban Ecology Studies’. Research Square. Available at: https://doi.org/10.21203/rs.3.rs-795506/v1.</w:t>
       </w:r>
     </w:p>
     <w:p>
@@ -12956,7 +14063,7 @@
           <w:rFonts w:ascii="Arial" w:hAnsi="Arial" w:cs="Arial"/>
           <w:sz w:val="22"/>
         </w:rPr>
-        <w:t xml:space="preserve">Sluka, C.M. </w:t>
+        <w:t xml:space="preserve">Schreiber, M. </w:t>
       </w:r>
       <w:r>
         <w:rPr>
@@ -12972,7 +14079,7 @@
           <w:rFonts w:ascii="Arial" w:hAnsi="Arial" w:cs="Arial"/>
           <w:sz w:val="22"/>
         </w:rPr>
-        <w:t xml:space="preserve"> (2025) ‘Patterns of Raccoon Craniodental Morphology under Urbanization’, </w:t>
+        <w:t xml:space="preserve"> (2021) ‘Evolution and Domestication of Rye’, in M.T. Rabanus-Wallace and N. Stein (eds) </w:t>
       </w:r>
       <w:r>
         <w:rPr>
@@ -12981,14 +14088,14 @@
           <w:iCs/>
           <w:sz w:val="22"/>
         </w:rPr>
-        <w:t>Integrative and Comparative Biology</w:t>
-      </w:r>
-      <w:r>
-        <w:rPr>
-          <w:rFonts w:ascii="Arial" w:hAnsi="Arial" w:cs="Arial"/>
-          <w:sz w:val="22"/>
-        </w:rPr>
-        <w:t>, 65(2), pp. 236–248. Available at: https://doi.org/10.1093/icb/icaf094.</w:t>
+        <w:t>The Rye Genome</w:t>
+      </w:r>
+      <w:r>
+        <w:rPr>
+          <w:rFonts w:ascii="Arial" w:hAnsi="Arial" w:cs="Arial"/>
+          <w:sz w:val="22"/>
+        </w:rPr>
+        <w:t>. Cham: Springer International Publishing, pp. 85–100. Available at: https://doi.org/10.1007/978-3-030-83383-1_6.</w:t>
       </w:r>
     </w:p>
     <w:p>
@@ -13004,7 +14111,7 @@
           <w:rFonts w:ascii="Arial" w:hAnsi="Arial" w:cs="Arial"/>
           <w:sz w:val="22"/>
         </w:rPr>
-        <w:t xml:space="preserve">Snell-Rood, E.C. and Wick, N. (2013) ‘Anthropogenic environments exert variable selection on cranial capacity in mammals’, </w:t>
+        <w:t xml:space="preserve">Sluka, C.M. </w:t>
       </w:r>
       <w:r>
         <w:rPr>
@@ -13013,14 +14120,30 @@
           <w:iCs/>
           <w:sz w:val="22"/>
         </w:rPr>
-        <w:t>Proceedings of the Royal Society B: Biological Sciences</w:t>
-      </w:r>
-      <w:r>
-        <w:rPr>
-          <w:rFonts w:ascii="Arial" w:hAnsi="Arial" w:cs="Arial"/>
-          <w:sz w:val="22"/>
-        </w:rPr>
-        <w:t>, 280(1769), p. 20131384. Available at: https://doi.org/10.1098/rspb.2013.1384.</w:t>
+        <w:t>et al.</w:t>
+      </w:r>
+      <w:r>
+        <w:rPr>
+          <w:rFonts w:ascii="Arial" w:hAnsi="Arial" w:cs="Arial"/>
+          <w:sz w:val="22"/>
+        </w:rPr>
+        <w:t xml:space="preserve"> (2025) ‘Patterns of Raccoon Craniodental Morphology under Urbanization’, </w:t>
+      </w:r>
+      <w:r>
+        <w:rPr>
+          <w:rFonts w:ascii="Arial" w:hAnsi="Arial" w:cs="Arial"/>
+          <w:i/>
+          <w:iCs/>
+          <w:sz w:val="22"/>
+        </w:rPr>
+        <w:t>Integrative and Comparative Biology</w:t>
+      </w:r>
+      <w:r>
+        <w:rPr>
+          <w:rFonts w:ascii="Arial" w:hAnsi="Arial" w:cs="Arial"/>
+          <w:sz w:val="22"/>
+        </w:rPr>
+        <w:t>, 65(2), pp. 236–248. Available at: https://doi.org/10.1093/icb/icaf094.</w:t>
       </w:r>
     </w:p>
     <w:p>
@@ -13036,7 +14159,23 @@
           <w:rFonts w:ascii="Arial" w:hAnsi="Arial" w:cs="Arial"/>
           <w:sz w:val="22"/>
         </w:rPr>
-        <w:t>Torchiano, M. (2020) ‘effsize: Efficient Effect Size Computation’. Available at: https://cran.r-project.org/web/packages/effsize/index.html (Accessed: 6 April 2026).</w:t>
+        <w:t xml:space="preserve">Snell-Rood, E.C. and Wick, N. (2013) ‘Anthropogenic environments exert variable selection on cranial capacity in mammals’, </w:t>
+      </w:r>
+      <w:r>
+        <w:rPr>
+          <w:rFonts w:ascii="Arial" w:hAnsi="Arial" w:cs="Arial"/>
+          <w:i/>
+          <w:iCs/>
+          <w:sz w:val="22"/>
+        </w:rPr>
+        <w:t>Proceedings of the Royal Society B: Biological Sciences</w:t>
+      </w:r>
+      <w:r>
+        <w:rPr>
+          <w:rFonts w:ascii="Arial" w:hAnsi="Arial" w:cs="Arial"/>
+          <w:sz w:val="22"/>
+        </w:rPr>
+        <w:t>, 280(1769), p. 20131384. Available at: https://doi.org/10.1098/rspb.2013.1384.</w:t>
       </w:r>
     </w:p>
     <w:p>
@@ -13047,28 +14186,37 @@
           <w:sz w:val="22"/>
         </w:rPr>
       </w:pPr>
-      <w:r>
-        <w:rPr>
-          <w:rFonts w:ascii="Arial" w:hAnsi="Arial" w:cs="Arial"/>
-          <w:sz w:val="22"/>
-        </w:rPr>
-        <w:t xml:space="preserve">Viechtbauer, W. (2010) ‘Conducting Meta-Analyses in R with the metafor Package’, </w:t>
-      </w:r>
-      <w:r>
-        <w:rPr>
-          <w:rFonts w:ascii="Arial" w:hAnsi="Arial" w:cs="Arial"/>
-          <w:i/>
-          <w:iCs/>
-          <w:sz w:val="22"/>
-        </w:rPr>
-        <w:t>Journal of Statistical Software</w:t>
-      </w:r>
-      <w:r>
-        <w:rPr>
-          <w:rFonts w:ascii="Arial" w:hAnsi="Arial" w:cs="Arial"/>
-          <w:sz w:val="22"/>
-        </w:rPr>
-        <w:t>, 36, pp. 1–48. Available at: https://doi.org/10.18637/jss.v036.i03.</w:t>
+      <w:proofErr w:type="spellStart"/>
+      <w:r>
+        <w:rPr>
+          <w:rFonts w:ascii="Arial" w:hAnsi="Arial" w:cs="Arial"/>
+          <w:sz w:val="22"/>
+        </w:rPr>
+        <w:t>Torchiano</w:t>
+      </w:r>
+      <w:proofErr w:type="spellEnd"/>
+      <w:r>
+        <w:rPr>
+          <w:rFonts w:ascii="Arial" w:hAnsi="Arial" w:cs="Arial"/>
+          <w:sz w:val="22"/>
+        </w:rPr>
+        <w:t>, M. (2020) ‘</w:t>
+      </w:r>
+      <w:proofErr w:type="spellStart"/>
+      <w:r>
+        <w:rPr>
+          <w:rFonts w:ascii="Arial" w:hAnsi="Arial" w:cs="Arial"/>
+          <w:sz w:val="22"/>
+        </w:rPr>
+        <w:t>effsize</w:t>
+      </w:r>
+      <w:proofErr w:type="spellEnd"/>
+      <w:r>
+        <w:rPr>
+          <w:rFonts w:ascii="Arial" w:hAnsi="Arial" w:cs="Arial"/>
+          <w:sz w:val="22"/>
+        </w:rPr>
+        <w:t>: Efficient Effect Size Computation’. Available at: https://cran.r-project.org/web/packages/effsize/index.html (Accessed: 6 April 2026).</w:t>
       </w:r>
     </w:p>
     <w:p>
@@ -13079,12 +14227,133 @@
           <w:sz w:val="22"/>
         </w:rPr>
       </w:pPr>
-      <w:r>
-        <w:rPr>
-          <w:rFonts w:ascii="Arial" w:hAnsi="Arial" w:cs="Arial"/>
-          <w:sz w:val="22"/>
-        </w:rPr>
-        <w:t xml:space="preserve">Wilkins, A.S., Wrangham, R.W. and Fitch, W.T. (2014) ‘The “Domestication Syndrome” in Mammals: A Unified Explanation Based on Neural Crest Cell Behavior and Genetics’, </w:t>
+      <w:proofErr w:type="spellStart"/>
+      <w:r>
+        <w:rPr>
+          <w:rFonts w:ascii="Arial" w:hAnsi="Arial" w:cs="Arial"/>
+          <w:sz w:val="22"/>
+        </w:rPr>
+        <w:t>Viechtbauer</w:t>
+      </w:r>
+      <w:proofErr w:type="spellEnd"/>
+      <w:r>
+        <w:rPr>
+          <w:rFonts w:ascii="Arial" w:hAnsi="Arial" w:cs="Arial"/>
+          <w:sz w:val="22"/>
+        </w:rPr>
+        <w:t xml:space="preserve">, W. (2010) ‘Conducting Meta-Analyses in R with the </w:t>
+      </w:r>
+      <w:proofErr w:type="spellStart"/>
+      <w:r>
+        <w:rPr>
+          <w:rFonts w:ascii="Arial" w:hAnsi="Arial" w:cs="Arial"/>
+          <w:sz w:val="22"/>
+        </w:rPr>
+        <w:t>metafor</w:t>
+      </w:r>
+      <w:proofErr w:type="spellEnd"/>
+      <w:r>
+        <w:rPr>
+          <w:rFonts w:ascii="Arial" w:hAnsi="Arial" w:cs="Arial"/>
+          <w:sz w:val="22"/>
+        </w:rPr>
+        <w:t xml:space="preserve"> Package’, </w:t>
+      </w:r>
+      <w:r>
+        <w:rPr>
+          <w:rFonts w:ascii="Arial" w:hAnsi="Arial" w:cs="Arial"/>
+          <w:i/>
+          <w:iCs/>
+          <w:sz w:val="22"/>
+        </w:rPr>
+        <w:t>Journal of Statistical Software</w:t>
+      </w:r>
+      <w:r>
+        <w:rPr>
+          <w:rFonts w:ascii="Arial" w:hAnsi="Arial" w:cs="Arial"/>
+          <w:sz w:val="22"/>
+        </w:rPr>
+        <w:t>, 36, pp. 1–48. Available at: https://doi.org/10.18637/jss.v036.i03.</w:t>
+      </w:r>
+    </w:p>
+    <w:p>
+      <w:pPr>
+        <w:pStyle w:val="Bibliography"/>
+        <w:rPr>
+          <w:rFonts w:ascii="Arial" w:hAnsi="Arial" w:cs="Arial"/>
+          <w:sz w:val="22"/>
+        </w:rPr>
+      </w:pPr>
+      <w:r>
+        <w:rPr>
+          <w:rFonts w:ascii="Arial" w:hAnsi="Arial" w:cs="Arial"/>
+          <w:sz w:val="22"/>
+        </w:rPr>
+        <w:t xml:space="preserve">Vitousek, P.M. </w:t>
+      </w:r>
+      <w:r>
+        <w:rPr>
+          <w:rFonts w:ascii="Arial" w:hAnsi="Arial" w:cs="Arial"/>
+          <w:i/>
+          <w:iCs/>
+          <w:sz w:val="22"/>
+        </w:rPr>
+        <w:t>et al.</w:t>
+      </w:r>
+      <w:r>
+        <w:rPr>
+          <w:rFonts w:ascii="Arial" w:hAnsi="Arial" w:cs="Arial"/>
+          <w:sz w:val="22"/>
+        </w:rPr>
+        <w:t xml:space="preserve"> (1997) ‘Human Domination of Earth’s Ecosystems’, </w:t>
+      </w:r>
+      <w:r>
+        <w:rPr>
+          <w:rFonts w:ascii="Arial" w:hAnsi="Arial" w:cs="Arial"/>
+          <w:i/>
+          <w:iCs/>
+          <w:sz w:val="22"/>
+        </w:rPr>
+        <w:t>Science</w:t>
+      </w:r>
+      <w:r>
+        <w:rPr>
+          <w:rFonts w:ascii="Arial" w:hAnsi="Arial" w:cs="Arial"/>
+          <w:sz w:val="22"/>
+        </w:rPr>
+        <w:t>, 277(5325), pp. 494–499. Available at: https://doi.org/10.1126/science.277.5325.494.</w:t>
+      </w:r>
+    </w:p>
+    <w:p>
+      <w:pPr>
+        <w:pStyle w:val="Bibliography"/>
+        <w:rPr>
+          <w:rFonts w:ascii="Arial" w:hAnsi="Arial" w:cs="Arial"/>
+          <w:sz w:val="22"/>
+        </w:rPr>
+      </w:pPr>
+      <w:r>
+        <w:rPr>
+          <w:rFonts w:ascii="Arial" w:hAnsi="Arial" w:cs="Arial"/>
+          <w:sz w:val="22"/>
+        </w:rPr>
+        <w:t xml:space="preserve">Wilkins, A.S., Wrangham, R.W. and Fitch, W.T. (2014) ‘The “Domestication Syndrome” in Mammals: A Unified Explanation Based on Neural Crest Cell </w:t>
+      </w:r>
+      <w:proofErr w:type="spellStart"/>
+      <w:r>
+        <w:rPr>
+          <w:rFonts w:ascii="Arial" w:hAnsi="Arial" w:cs="Arial"/>
+          <w:sz w:val="22"/>
+        </w:rPr>
+        <w:t>Behavior</w:t>
+      </w:r>
+      <w:proofErr w:type="spellEnd"/>
+      <w:r>
+        <w:rPr>
+          <w:rFonts w:ascii="Arial" w:hAnsi="Arial" w:cs="Arial"/>
+          <w:sz w:val="22"/>
+        </w:rPr>
+        <w:t xml:space="preserve"> and Genetics’, </w:t>
       </w:r>
       <w:r>
         <w:rPr>
@@ -14745,10 +16014,10 @@
     <w:rsid w:val="008B51A8"/>
     <w:rsid w:val="009A5A43"/>
     <w:rsid w:val="00AE1665"/>
-    <w:rsid w:val="00BB1329"/>
     <w:rsid w:val="00BC5197"/>
     <w:rsid w:val="00C72DE4"/>
     <w:rsid w:val="00DA7A95"/>
+    <w:rsid w:val="00E55C0C"/>
   </w:rsids>
   <m:mathPr>
     <m:mathFont m:val="Cambria Math"/>

</xml_diff>